<commit_message>
paper: real indexes, literature + provenance, float fix
- docx: literal Figure 1-12 / Table 1-21 numbering (headless LO renders
  every SEQ field as 1); static Contents/LoF/LoT with real PDF-derived
  page numbers via scripts/finalize_docx.py (3-round convergence,
  self-match guard); INDEX placeholder stripped
- latex: placeins per-section barriers + htbp floats (no end-of-document
  figure pile-up after References)
- content from presentation/proposal: task provenance + pilot, i5-8250U
  host detail, adaptive invocation + workload aliasing + rescue pass,
  Dream-of-Energy-Efficient-Code + EffiBench (+2 refs), carbon scope
  box + current-data scale arithmetic, author contributions
- verified: captions unique, LoT pages monotone, 0 placeholders
</commit_message>
<xml_diff>
--- a/docx/green-code-interaction-benchmark.docx
+++ b/docx/green-code-interaction-benchmark.docx
@@ -408,8 +408,1454 @@
         <w:fldChar w:fldCharType="begin"/>
         <w:instrText xml:space="preserve">TOC \o "1-3" \h \z \u</w:instrText>
         <w:fldChar w:fldCharType="separate"/>
-        <w:t>Right-click → Update Field to build the table of contents.</w:t>
+        <w:t/>
         <w:fldChar w:fldCharType="end"/>
+      </w:r>
+    </w:p>
+    <w:p>
+      <w:r>
+        <w:rPr>
+          <w:vanish/>
+        </w:rPr>
+        <w:t>STATIC-LIST-toc-BEGIN</w:t>
+      </w:r>
+    </w:p>
+    <w:p>
+      <w:pPr>
+        <w:tabs>
+          <w:tab w:val="right" w:leader="dot" w:pos="9350"/>
+        </w:tabs>
+        <w:rPr>
+          <w:sz w:val="19"/>
+        </w:rPr>
+      </w:pPr>
+      <w:r>
+        <w:rPr>
+          <w:sz w:val="19"/>
+        </w:rPr>
+        <w:t xml:space="preserve">Abstract	</w:t>
+      </w:r>
+      <w:r>
+        <w:rPr>
+          <w:sz w:val="19"/>
+        </w:rPr>
+        <w:t xml:space="preserve">2</w:t>
+      </w:r>
+    </w:p>
+    <w:p>
+      <w:pPr>
+        <w:tabs>
+          <w:tab w:val="right" w:leader="dot" w:pos="9350"/>
+        </w:tabs>
+        <w:rPr>
+          <w:sz w:val="19"/>
+        </w:rPr>
+      </w:pPr>
+      <w:r>
+        <w:rPr>
+          <w:sz w:val="19"/>
+        </w:rPr>
+        <w:t xml:space="preserve">1  Introduction	</w:t>
+      </w:r>
+      <w:r>
+        <w:rPr>
+          <w:sz w:val="19"/>
+        </w:rPr>
+        <w:t xml:space="preserve">3</w:t>
+      </w:r>
+    </w:p>
+    <w:p>
+      <w:pPr>
+        <w:tabs>
+          <w:tab w:val="right" w:leader="dot" w:pos="9350"/>
+        </w:tabs>
+        <w:rPr>
+          <w:sz w:val="19"/>
+        </w:rPr>
+      </w:pPr>
+      <w:r>
+        <w:rPr>
+          <w:sz w:val="19"/>
+        </w:rPr>
+        <w:t xml:space="preserve">1.1  Motivation and context	</w:t>
+      </w:r>
+      <w:r>
+        <w:rPr>
+          <w:sz w:val="19"/>
+        </w:rPr>
+        <w:t xml:space="preserve">3</w:t>
+      </w:r>
+    </w:p>
+    <w:p>
+      <w:pPr>
+        <w:tabs>
+          <w:tab w:val="right" w:leader="dot" w:pos="9350"/>
+        </w:tabs>
+        <w:rPr>
+          <w:sz w:val="19"/>
+        </w:rPr>
+      </w:pPr>
+      <w:r>
+        <w:rPr>
+          <w:sz w:val="19"/>
+        </w:rPr>
+        <w:t xml:space="preserve">1.2  Problem statement	</w:t>
+      </w:r>
+      <w:r>
+        <w:rPr>
+          <w:sz w:val="19"/>
+        </w:rPr>
+        <w:t xml:space="preserve">3</w:t>
+      </w:r>
+    </w:p>
+    <w:p>
+      <w:pPr>
+        <w:tabs>
+          <w:tab w:val="right" w:leader="dot" w:pos="9350"/>
+        </w:tabs>
+        <w:rPr>
+          <w:sz w:val="19"/>
+        </w:rPr>
+      </w:pPr>
+      <w:r>
+        <w:rPr>
+          <w:sz w:val="19"/>
+        </w:rPr>
+        <w:t xml:space="preserve">1.3  Research questions	</w:t>
+      </w:r>
+      <w:r>
+        <w:rPr>
+          <w:sz w:val="19"/>
+        </w:rPr>
+        <w:t xml:space="preserve">3</w:t>
+      </w:r>
+    </w:p>
+    <w:p>
+      <w:pPr>
+        <w:tabs>
+          <w:tab w:val="right" w:leader="dot" w:pos="9350"/>
+        </w:tabs>
+        <w:rPr>
+          <w:sz w:val="19"/>
+        </w:rPr>
+      </w:pPr>
+      <w:r>
+        <w:rPr>
+          <w:sz w:val="19"/>
+        </w:rPr>
+        <w:t xml:space="preserve">1.4  Contributions	</w:t>
+      </w:r>
+      <w:r>
+        <w:rPr>
+          <w:sz w:val="19"/>
+        </w:rPr>
+        <w:t xml:space="preserve">3</w:t>
+      </w:r>
+    </w:p>
+    <w:p>
+      <w:pPr>
+        <w:tabs>
+          <w:tab w:val="right" w:leader="dot" w:pos="9350"/>
+        </w:tabs>
+        <w:rPr>
+          <w:sz w:val="19"/>
+        </w:rPr>
+      </w:pPr>
+      <w:r>
+        <w:rPr>
+          <w:sz w:val="19"/>
+        </w:rPr>
+        <w:t xml:space="preserve">1.5  Organisation	</w:t>
+      </w:r>
+      <w:r>
+        <w:rPr>
+          <w:sz w:val="19"/>
+        </w:rPr>
+        <w:t xml:space="preserve">3</w:t>
+      </w:r>
+    </w:p>
+    <w:p>
+      <w:pPr>
+        <w:tabs>
+          <w:tab w:val="right" w:leader="dot" w:pos="9350"/>
+        </w:tabs>
+        <w:rPr>
+          <w:sz w:val="19"/>
+        </w:rPr>
+      </w:pPr>
+      <w:r>
+        <w:rPr>
+          <w:sz w:val="19"/>
+        </w:rPr>
+        <w:t xml:space="preserve">2  Background and related work	</w:t>
+      </w:r>
+      <w:r>
+        <w:rPr>
+          <w:sz w:val="19"/>
+        </w:rPr>
+        <w:t xml:space="preserve">3</w:t>
+      </w:r>
+    </w:p>
+    <w:p>
+      <w:pPr>
+        <w:tabs>
+          <w:tab w:val="right" w:leader="dot" w:pos="9350"/>
+        </w:tabs>
+        <w:rPr>
+          <w:sz w:val="19"/>
+        </w:rPr>
+      </w:pPr>
+      <w:r>
+        <w:rPr>
+          <w:sz w:val="19"/>
+        </w:rPr>
+        <w:t xml:space="preserve">2.1  Energy efficiency of software	</w:t>
+      </w:r>
+      <w:r>
+        <w:rPr>
+          <w:sz w:val="19"/>
+        </w:rPr>
+        <w:t xml:space="preserve">3</w:t>
+      </w:r>
+    </w:p>
+    <w:p>
+      <w:pPr>
+        <w:tabs>
+          <w:tab w:val="right" w:leader="dot" w:pos="9350"/>
+        </w:tabs>
+        <w:rPr>
+          <w:sz w:val="19"/>
+        </w:rPr>
+      </w:pPr>
+      <w:r>
+        <w:rPr>
+          <w:sz w:val="19"/>
+        </w:rPr>
+        <w:t xml:space="preserve">2.2  LLMs for code generation	</w:t>
+      </w:r>
+      <w:r>
+        <w:rPr>
+          <w:sz w:val="19"/>
+        </w:rPr>
+        <w:t xml:space="preserve">3</w:t>
+      </w:r>
+    </w:p>
+    <w:p>
+      <w:pPr>
+        <w:tabs>
+          <w:tab w:val="right" w:leader="dot" w:pos="9350"/>
+        </w:tabs>
+        <w:rPr>
+          <w:sz w:val="19"/>
+        </w:rPr>
+      </w:pPr>
+      <w:r>
+        <w:rPr>
+          <w:sz w:val="19"/>
+        </w:rPr>
+        <w:t xml:space="preserve">2.3  Multi-turn and interactive code generation	</w:t>
+      </w:r>
+      <w:r>
+        <w:rPr>
+          <w:sz w:val="19"/>
+        </w:rPr>
+        <w:t xml:space="preserve">3</w:t>
+      </w:r>
+    </w:p>
+    <w:p>
+      <w:pPr>
+        <w:tabs>
+          <w:tab w:val="right" w:leader="dot" w:pos="9350"/>
+        </w:tabs>
+        <w:rPr>
+          <w:sz w:val="19"/>
+        </w:rPr>
+      </w:pPr>
+      <w:r>
+        <w:rPr>
+          <w:sz w:val="19"/>
+        </w:rPr>
+        <w:t xml:space="preserve">2.4  Static metrics and algorithmic complexity	</w:t>
+      </w:r>
+      <w:r>
+        <w:rPr>
+          <w:sz w:val="19"/>
+        </w:rPr>
+        <w:t xml:space="preserve">3</w:t>
+      </w:r>
+    </w:p>
+    <w:p>
+      <w:pPr>
+        <w:tabs>
+          <w:tab w:val="right" w:leader="dot" w:pos="9350"/>
+        </w:tabs>
+        <w:rPr>
+          <w:sz w:val="19"/>
+        </w:rPr>
+      </w:pPr>
+      <w:r>
+        <w:rPr>
+          <w:sz w:val="19"/>
+        </w:rPr>
+        <w:t xml:space="preserve">2.5  Research gap	</w:t>
+      </w:r>
+      <w:r>
+        <w:rPr>
+          <w:sz w:val="19"/>
+        </w:rPr>
+        <w:t xml:space="preserve">3</w:t>
+      </w:r>
+    </w:p>
+    <w:p>
+      <w:pPr>
+        <w:tabs>
+          <w:tab w:val="right" w:leader="dot" w:pos="9350"/>
+        </w:tabs>
+        <w:rPr>
+          <w:sz w:val="19"/>
+        </w:rPr>
+      </w:pPr>
+      <w:r>
+        <w:rPr>
+          <w:sz w:val="19"/>
+        </w:rPr>
+        <w:t xml:space="preserve">3  Benchmark design and methodology	</w:t>
+      </w:r>
+      <w:r>
+        <w:rPr>
+          <w:sz w:val="19"/>
+        </w:rPr>
+        <w:t xml:space="preserve">3</w:t>
+      </w:r>
+    </w:p>
+    <w:p>
+      <w:pPr>
+        <w:tabs>
+          <w:tab w:val="right" w:leader="dot" w:pos="9350"/>
+        </w:tabs>
+        <w:rPr>
+          <w:sz w:val="19"/>
+        </w:rPr>
+      </w:pPr>
+      <w:r>
+        <w:rPr>
+          <w:sz w:val="19"/>
+        </w:rPr>
+        <w:t xml:space="preserve">3.1  Overview	</w:t>
+      </w:r>
+      <w:r>
+        <w:rPr>
+          <w:sz w:val="19"/>
+        </w:rPr>
+        <w:t xml:space="preserve">3</w:t>
+      </w:r>
+    </w:p>
+    <w:p>
+      <w:pPr>
+        <w:tabs>
+          <w:tab w:val="right" w:leader="dot" w:pos="9350"/>
+        </w:tabs>
+        <w:rPr>
+          <w:sz w:val="19"/>
+        </w:rPr>
+      </w:pPr>
+      <w:r>
+        <w:rPr>
+          <w:sz w:val="19"/>
+        </w:rPr>
+        <w:t xml:space="preserve">3.2  Task taxonomy	</w:t>
+      </w:r>
+      <w:r>
+        <w:rPr>
+          <w:sz w:val="19"/>
+        </w:rPr>
+        <w:t xml:space="preserve">3</w:t>
+      </w:r>
+    </w:p>
+    <w:p>
+      <w:pPr>
+        <w:tabs>
+          <w:tab w:val="right" w:leader="dot" w:pos="9350"/>
+        </w:tabs>
+        <w:rPr>
+          <w:sz w:val="19"/>
+        </w:rPr>
+      </w:pPr>
+      <w:r>
+        <w:rPr>
+          <w:sz w:val="19"/>
+        </w:rPr>
+        <w:t xml:space="preserve">3.3  Interaction conditions	</w:t>
+      </w:r>
+      <w:r>
+        <w:rPr>
+          <w:sz w:val="19"/>
+        </w:rPr>
+        <w:t xml:space="preserve">3</w:t>
+      </w:r>
+    </w:p>
+    <w:p>
+      <w:pPr>
+        <w:tabs>
+          <w:tab w:val="right" w:leader="dot" w:pos="9350"/>
+        </w:tabs>
+        <w:rPr>
+          <w:sz w:val="19"/>
+        </w:rPr>
+      </w:pPr>
+      <w:r>
+        <w:rPr>
+          <w:sz w:val="19"/>
+        </w:rPr>
+        <w:t xml:space="preserve">3.4  Models and generation	</w:t>
+      </w:r>
+      <w:r>
+        <w:rPr>
+          <w:sz w:val="19"/>
+        </w:rPr>
+        <w:t xml:space="preserve">3</w:t>
+      </w:r>
+    </w:p>
+    <w:p>
+      <w:pPr>
+        <w:tabs>
+          <w:tab w:val="right" w:leader="dot" w:pos="9350"/>
+        </w:tabs>
+        <w:rPr>
+          <w:sz w:val="19"/>
+        </w:rPr>
+      </w:pPr>
+      <w:r>
+        <w:rPr>
+          <w:sz w:val="19"/>
+        </w:rPr>
+        <w:t xml:space="preserve">3.5  Correctness and harness protocol	</w:t>
+      </w:r>
+      <w:r>
+        <w:rPr>
+          <w:sz w:val="19"/>
+        </w:rPr>
+        <w:t xml:space="preserve">3</w:t>
+      </w:r>
+    </w:p>
+    <w:p>
+      <w:pPr>
+        <w:tabs>
+          <w:tab w:val="right" w:leader="dot" w:pos="9350"/>
+        </w:tabs>
+        <w:rPr>
+          <w:sz w:val="19"/>
+        </w:rPr>
+      </w:pPr>
+      <w:r>
+        <w:rPr>
+          <w:sz w:val="19"/>
+        </w:rPr>
+        <w:t xml:space="preserve">3.6  Energy measurement (Intel RAPL)	</w:t>
+      </w:r>
+      <w:r>
+        <w:rPr>
+          <w:sz w:val="19"/>
+        </w:rPr>
+        <w:t xml:space="preserve">3</w:t>
+      </w:r>
+    </w:p>
+    <w:p>
+      <w:pPr>
+        <w:tabs>
+          <w:tab w:val="right" w:leader="dot" w:pos="9350"/>
+        </w:tabs>
+        <w:rPr>
+          <w:sz w:val="19"/>
+        </w:rPr>
+      </w:pPr>
+      <w:r>
+        <w:rPr>
+          <w:sz w:val="19"/>
+        </w:rPr>
+        <w:t xml:space="preserve">3.7  Runtime, memory, power	</w:t>
+      </w:r>
+      <w:r>
+        <w:rPr>
+          <w:sz w:val="19"/>
+        </w:rPr>
+        <w:t xml:space="preserve">3</w:t>
+      </w:r>
+    </w:p>
+    <w:p>
+      <w:pPr>
+        <w:tabs>
+          <w:tab w:val="right" w:leader="dot" w:pos="9350"/>
+        </w:tabs>
+        <w:rPr>
+          <w:sz w:val="19"/>
+        </w:rPr>
+      </w:pPr>
+      <w:r>
+        <w:rPr>
+          <w:sz w:val="19"/>
+        </w:rPr>
+        <w:t xml:space="preserve">3.8  Static code metrics	</w:t>
+      </w:r>
+      <w:r>
+        <w:rPr>
+          <w:sz w:val="19"/>
+        </w:rPr>
+        <w:t xml:space="preserve">3</w:t>
+      </w:r>
+    </w:p>
+    <w:p>
+      <w:pPr>
+        <w:tabs>
+          <w:tab w:val="right" w:leader="dot" w:pos="9350"/>
+        </w:tabs>
+        <w:rPr>
+          <w:sz w:val="19"/>
+        </w:rPr>
+      </w:pPr>
+      <w:r>
+        <w:rPr>
+          <w:sz w:val="19"/>
+        </w:rPr>
+        <w:t xml:space="preserve">3.9  Static time-complexity estimation	</w:t>
+      </w:r>
+      <w:r>
+        <w:rPr>
+          <w:sz w:val="19"/>
+        </w:rPr>
+        <w:t xml:space="preserve">3</w:t>
+      </w:r>
+    </w:p>
+    <w:p>
+      <w:pPr>
+        <w:tabs>
+          <w:tab w:val="right" w:leader="dot" w:pos="9350"/>
+        </w:tabs>
+        <w:rPr>
+          <w:sz w:val="19"/>
+        </w:rPr>
+      </w:pPr>
+      <w:r>
+        <w:rPr>
+          <w:sz w:val="19"/>
+        </w:rPr>
+        <w:t xml:space="preserve">3.10  Empirical scaling probe	</w:t>
+      </w:r>
+      <w:r>
+        <w:rPr>
+          <w:sz w:val="19"/>
+        </w:rPr>
+        <w:t xml:space="preserve">3</w:t>
+      </w:r>
+    </w:p>
+    <w:p>
+      <w:pPr>
+        <w:tabs>
+          <w:tab w:val="right" w:leader="dot" w:pos="9350"/>
+        </w:tabs>
+        <w:rPr>
+          <w:sz w:val="19"/>
+        </w:rPr>
+      </w:pPr>
+      <w:r>
+        <w:rPr>
+          <w:sz w:val="19"/>
+        </w:rPr>
+        <w:t xml:space="preserve">3.11  Carbon-equivalent estimation	</w:t>
+      </w:r>
+      <w:r>
+        <w:rPr>
+          <w:sz w:val="19"/>
+        </w:rPr>
+        <w:t xml:space="preserve">3</w:t>
+      </w:r>
+    </w:p>
+    <w:p>
+      <w:pPr>
+        <w:tabs>
+          <w:tab w:val="right" w:leader="dot" w:pos="9350"/>
+        </w:tabs>
+        <w:rPr>
+          <w:sz w:val="19"/>
+        </w:rPr>
+      </w:pPr>
+      <w:r>
+        <w:rPr>
+          <w:sz w:val="19"/>
+        </w:rPr>
+        <w:t xml:space="preserve">3.12  Statistical analysis	</w:t>
+      </w:r>
+      <w:r>
+        <w:rPr>
+          <w:sz w:val="19"/>
+        </w:rPr>
+        <w:t xml:space="preserve">3</w:t>
+      </w:r>
+    </w:p>
+    <w:p>
+      <w:pPr>
+        <w:tabs>
+          <w:tab w:val="right" w:leader="dot" w:pos="9350"/>
+        </w:tabs>
+        <w:rPr>
+          <w:sz w:val="19"/>
+        </w:rPr>
+      </w:pPr>
+      <w:r>
+        <w:rPr>
+          <w:sz w:val="19"/>
+        </w:rPr>
+        <w:t xml:space="preserve">3.13  Reproducibility	</w:t>
+      </w:r>
+      <w:r>
+        <w:rPr>
+          <w:sz w:val="19"/>
+        </w:rPr>
+        <w:t xml:space="preserve">3</w:t>
+      </w:r>
+    </w:p>
+    <w:p>
+      <w:pPr>
+        <w:tabs>
+          <w:tab w:val="right" w:leader="dot" w:pos="9350"/>
+        </w:tabs>
+        <w:rPr>
+          <w:sz w:val="19"/>
+        </w:rPr>
+      </w:pPr>
+      <w:r>
+        <w:rPr>
+          <w:sz w:val="19"/>
+        </w:rPr>
+        <w:t xml:space="preserve">4  Results	</w:t>
+      </w:r>
+      <w:r>
+        <w:rPr>
+          <w:sz w:val="19"/>
+        </w:rPr>
+        <w:t xml:space="preserve">3</w:t>
+      </w:r>
+    </w:p>
+    <w:p>
+      <w:pPr>
+        <w:tabs>
+          <w:tab w:val="right" w:leader="dot" w:pos="9350"/>
+        </w:tabs>
+        <w:rPr>
+          <w:sz w:val="19"/>
+        </w:rPr>
+      </w:pPr>
+      <w:r>
+        <w:rPr>
+          <w:sz w:val="19"/>
+        </w:rPr>
+        <w:t xml:space="preserve">4.1  Dataset and measurement coverage	</w:t>
+      </w:r>
+      <w:r>
+        <w:rPr>
+          <w:sz w:val="19"/>
+        </w:rPr>
+        <w:t xml:space="preserve">4</w:t>
+      </w:r>
+    </w:p>
+    <w:p>
+      <w:pPr>
+        <w:tabs>
+          <w:tab w:val="right" w:leader="dot" w:pos="9350"/>
+        </w:tabs>
+        <w:rPr>
+          <w:sz w:val="19"/>
+        </w:rPr>
+      </w:pPr>
+      <w:r>
+        <w:rPr>
+          <w:sz w:val="19"/>
+        </w:rPr>
+        <w:t xml:space="preserve">4.2  Energy by interaction condition (RQ1)	</w:t>
+      </w:r>
+      <w:r>
+        <w:rPr>
+          <w:sz w:val="19"/>
+        </w:rPr>
+        <w:t xml:space="preserve">4</w:t>
+      </w:r>
+    </w:p>
+    <w:p>
+      <w:pPr>
+        <w:tabs>
+          <w:tab w:val="right" w:leader="dot" w:pos="9350"/>
+        </w:tabs>
+        <w:rPr>
+          <w:sz w:val="19"/>
+        </w:rPr>
+      </w:pPr>
+      <w:r>
+        <w:rPr>
+          <w:sz w:val="19"/>
+        </w:rPr>
+        <w:t xml:space="preserve">4.3  Paired analysis: ΔE versus one-shot (RQ1, RQ3)	</w:t>
+      </w:r>
+      <w:r>
+        <w:rPr>
+          <w:sz w:val="19"/>
+        </w:rPr>
+        <w:t xml:space="preserve">4</w:t>
+      </w:r>
+    </w:p>
+    <w:p>
+      <w:pPr>
+        <w:tabs>
+          <w:tab w:val="right" w:leader="dot" w:pos="9350"/>
+        </w:tabs>
+        <w:rPr>
+          <w:sz w:val="19"/>
+        </w:rPr>
+      </w:pPr>
+      <w:r>
+        <w:rPr>
+          <w:sz w:val="19"/>
+        </w:rPr>
+        <w:t xml:space="preserve">4.4  Model-specific effects (RQ2)	</w:t>
+      </w:r>
+      <w:r>
+        <w:rPr>
+          <w:sz w:val="19"/>
+        </w:rPr>
+        <w:t xml:space="preserve">4</w:t>
+      </w:r>
+    </w:p>
+    <w:p>
+      <w:pPr>
+        <w:tabs>
+          <w:tab w:val="right" w:leader="dot" w:pos="9350"/>
+        </w:tabs>
+        <w:rPr>
+          <w:sz w:val="19"/>
+        </w:rPr>
+      </w:pPr>
+      <w:r>
+        <w:rPr>
+          <w:sz w:val="19"/>
+        </w:rPr>
+        <w:t xml:space="preserve">4.5  Category-specific effects	</w:t>
+      </w:r>
+      <w:r>
+        <w:rPr>
+          <w:sz w:val="19"/>
+        </w:rPr>
+        <w:t xml:space="preserve">4</w:t>
+      </w:r>
+    </w:p>
+    <w:p>
+      <w:pPr>
+        <w:tabs>
+          <w:tab w:val="right" w:leader="dot" w:pos="9350"/>
+        </w:tabs>
+        <w:rPr>
+          <w:sz w:val="19"/>
+        </w:rPr>
+      </w:pPr>
+      <w:r>
+        <w:rPr>
+          <w:sz w:val="19"/>
+        </w:rPr>
+        <w:t xml:space="preserve">4.6  Runtime, power, memory (RQ4)	</w:t>
+      </w:r>
+      <w:r>
+        <w:rPr>
+          <w:sz w:val="19"/>
+        </w:rPr>
+        <w:t xml:space="preserve">4</w:t>
+      </w:r>
+    </w:p>
+    <w:p>
+      <w:pPr>
+        <w:tabs>
+          <w:tab w:val="right" w:leader="dot" w:pos="9350"/>
+        </w:tabs>
+        <w:rPr>
+          <w:sz w:val="19"/>
+        </w:rPr>
+      </w:pPr>
+      <w:r>
+        <w:rPr>
+          <w:sz w:val="19"/>
+        </w:rPr>
+        <w:t xml:space="preserve">4.7  Static code metrics (RQ5)	</w:t>
+      </w:r>
+      <w:r>
+        <w:rPr>
+          <w:sz w:val="19"/>
+        </w:rPr>
+        <w:t xml:space="preserve">4</w:t>
+      </w:r>
+    </w:p>
+    <w:p>
+      <w:pPr>
+        <w:tabs>
+          <w:tab w:val="right" w:leader="dot" w:pos="9350"/>
+        </w:tabs>
+        <w:rPr>
+          <w:sz w:val="19"/>
+        </w:rPr>
+      </w:pPr>
+      <w:r>
+        <w:rPr>
+          <w:sz w:val="19"/>
+        </w:rPr>
+        <w:t xml:space="preserve">4.8  Time-complexity distribution (RQ5)	</w:t>
+      </w:r>
+      <w:r>
+        <w:rPr>
+          <w:sz w:val="19"/>
+        </w:rPr>
+        <w:t xml:space="preserve">4</w:t>
+      </w:r>
+    </w:p>
+    <w:p>
+      <w:pPr>
+        <w:tabs>
+          <w:tab w:val="right" w:leader="dot" w:pos="9350"/>
+        </w:tabs>
+        <w:rPr>
+          <w:sz w:val="19"/>
+        </w:rPr>
+      </w:pPr>
+      <w:r>
+        <w:rPr>
+          <w:sz w:val="19"/>
+        </w:rPr>
+        <w:t xml:space="preserve">4.9  Estimated versus empirical complexity	</w:t>
+      </w:r>
+      <w:r>
+        <w:rPr>
+          <w:sz w:val="19"/>
+        </w:rPr>
+        <w:t xml:space="preserve">4</w:t>
+      </w:r>
+    </w:p>
+    <w:p>
+      <w:pPr>
+        <w:tabs>
+          <w:tab w:val="right" w:leader="dot" w:pos="9350"/>
+        </w:tabs>
+        <w:rPr>
+          <w:sz w:val="19"/>
+        </w:rPr>
+      </w:pPr>
+      <w:r>
+        <w:rPr>
+          <w:sz w:val="19"/>
+        </w:rPr>
+        <w:t xml:space="preserve">4.10  Complexity, size, and energy (RQ5)	</w:t>
+      </w:r>
+      <w:r>
+        <w:rPr>
+          <w:sz w:val="19"/>
+        </w:rPr>
+        <w:t xml:space="preserve">4</w:t>
+      </w:r>
+    </w:p>
+    <w:p>
+      <w:pPr>
+        <w:tabs>
+          <w:tab w:val="right" w:leader="dot" w:pos="9350"/>
+        </w:tabs>
+        <w:rPr>
+          <w:sz w:val="19"/>
+        </w:rPr>
+      </w:pPr>
+      <w:r>
+        <w:rPr>
+          <w:sz w:val="19"/>
+        </w:rPr>
+        <w:t xml:space="preserve">4.11  Carbon-equivalent emissions	</w:t>
+      </w:r>
+      <w:r>
+        <w:rPr>
+          <w:sz w:val="19"/>
+        </w:rPr>
+        <w:t xml:space="preserve">4</w:t>
+      </w:r>
+    </w:p>
+    <w:p>
+      <w:pPr>
+        <w:tabs>
+          <w:tab w:val="right" w:leader="dot" w:pos="9350"/>
+        </w:tabs>
+        <w:rPr>
+          <w:sz w:val="19"/>
+        </w:rPr>
+      </w:pPr>
+      <w:r>
+        <w:rPr>
+          <w:sz w:val="19"/>
+        </w:rPr>
+        <w:t xml:space="preserve">4.12  Failure taxonomy and coverage bias	</w:t>
+      </w:r>
+      <w:r>
+        <w:rPr>
+          <w:sz w:val="19"/>
+        </w:rPr>
+        <w:t xml:space="preserve">4</w:t>
+      </w:r>
+    </w:p>
+    <w:p>
+      <w:pPr>
+        <w:tabs>
+          <w:tab w:val="right" w:leader="dot" w:pos="9350"/>
+        </w:tabs>
+        <w:rPr>
+          <w:sz w:val="19"/>
+        </w:rPr>
+      </w:pPr>
+      <w:r>
+        <w:rPr>
+          <w:sz w:val="19"/>
+        </w:rPr>
+        <w:t xml:space="preserve">5  Discussion	</w:t>
+      </w:r>
+      <w:r>
+        <w:rPr>
+          <w:sz w:val="19"/>
+        </w:rPr>
+        <w:t xml:space="preserve">4</w:t>
+      </w:r>
+    </w:p>
+    <w:p>
+      <w:pPr>
+        <w:tabs>
+          <w:tab w:val="right" w:leader="dot" w:pos="9350"/>
+        </w:tabs>
+        <w:rPr>
+          <w:sz w:val="19"/>
+        </w:rPr>
+      </w:pPr>
+      <w:r>
+        <w:rPr>
+          <w:sz w:val="19"/>
+        </w:rPr>
+        <w:t xml:space="preserve">5.1  Interpretation	</w:t>
+      </w:r>
+      <w:r>
+        <w:rPr>
+          <w:sz w:val="19"/>
+        </w:rPr>
+        <w:t xml:space="preserve">4</w:t>
+      </w:r>
+    </w:p>
+    <w:p>
+      <w:pPr>
+        <w:tabs>
+          <w:tab w:val="right" w:leader="dot" w:pos="9350"/>
+        </w:tabs>
+        <w:rPr>
+          <w:sz w:val="19"/>
+        </w:rPr>
+      </w:pPr>
+      <w:r>
+        <w:rPr>
+          <w:sz w:val="19"/>
+        </w:rPr>
+        <w:t xml:space="preserve">5.2  Why multi-turn programs consume more energy	</w:t>
+      </w:r>
+      <w:r>
+        <w:rPr>
+          <w:sz w:val="19"/>
+        </w:rPr>
+        <w:t xml:space="preserve">4</w:t>
+      </w:r>
+    </w:p>
+    <w:p>
+      <w:pPr>
+        <w:tabs>
+          <w:tab w:val="right" w:leader="dot" w:pos="9350"/>
+        </w:tabs>
+        <w:rPr>
+          <w:sz w:val="19"/>
+        </w:rPr>
+      </w:pPr>
+      <w:r>
+        <w:rPr>
+          <w:sz w:val="19"/>
+        </w:rPr>
+        <w:t xml:space="preserve">5.3  Complexity as a mediator	</w:t>
+      </w:r>
+      <w:r>
+        <w:rPr>
+          <w:sz w:val="19"/>
+        </w:rPr>
+        <w:t xml:space="preserve">4</w:t>
+      </w:r>
+    </w:p>
+    <w:p>
+      <w:pPr>
+        <w:tabs>
+          <w:tab w:val="right" w:leader="dot" w:pos="9350"/>
+        </w:tabs>
+        <w:rPr>
+          <w:sz w:val="19"/>
+        </w:rPr>
+      </w:pPr>
+      <w:r>
+        <w:rPr>
+          <w:sz w:val="19"/>
+        </w:rPr>
+        <w:t xml:space="preserve">5.4  Implications for practitioners	</w:t>
+      </w:r>
+      <w:r>
+        <w:rPr>
+          <w:sz w:val="19"/>
+        </w:rPr>
+        <w:t xml:space="preserve">4</w:t>
+      </w:r>
+    </w:p>
+    <w:p>
+      <w:pPr>
+        <w:tabs>
+          <w:tab w:val="right" w:leader="dot" w:pos="9350"/>
+        </w:tabs>
+        <w:rPr>
+          <w:sz w:val="19"/>
+        </w:rPr>
+      </w:pPr>
+      <w:r>
+        <w:rPr>
+          <w:sz w:val="19"/>
+        </w:rPr>
+        <w:t xml:space="preserve">5.5  Implications for tool builders	</w:t>
+      </w:r>
+      <w:r>
+        <w:rPr>
+          <w:sz w:val="19"/>
+        </w:rPr>
+        <w:t xml:space="preserve">4</w:t>
+      </w:r>
+    </w:p>
+    <w:p>
+      <w:pPr>
+        <w:tabs>
+          <w:tab w:val="right" w:leader="dot" w:pos="9350"/>
+        </w:tabs>
+        <w:rPr>
+          <w:sz w:val="19"/>
+        </w:rPr>
+      </w:pPr>
+      <w:r>
+        <w:rPr>
+          <w:sz w:val="19"/>
+        </w:rPr>
+        <w:t xml:space="preserve">5.6  Carbon scope and scale	</w:t>
+      </w:r>
+      <w:r>
+        <w:rPr>
+          <w:sz w:val="19"/>
+        </w:rPr>
+        <w:t xml:space="preserve">4</w:t>
+      </w:r>
+    </w:p>
+    <w:p>
+      <w:pPr>
+        <w:tabs>
+          <w:tab w:val="right" w:leader="dot" w:pos="9350"/>
+        </w:tabs>
+        <w:rPr>
+          <w:sz w:val="19"/>
+        </w:rPr>
+      </w:pPr>
+      <w:r>
+        <w:rPr>
+          <w:sz w:val="19"/>
+        </w:rPr>
+        <w:t xml:space="preserve">6  Threats to validity	</w:t>
+      </w:r>
+      <w:r>
+        <w:rPr>
+          <w:sz w:val="19"/>
+        </w:rPr>
+        <w:t xml:space="preserve">4</w:t>
+      </w:r>
+    </w:p>
+    <w:p>
+      <w:pPr>
+        <w:tabs>
+          <w:tab w:val="right" w:leader="dot" w:pos="9350"/>
+        </w:tabs>
+        <w:rPr>
+          <w:sz w:val="19"/>
+        </w:rPr>
+      </w:pPr>
+      <w:r>
+        <w:rPr>
+          <w:sz w:val="19"/>
+        </w:rPr>
+        <w:t xml:space="preserve">6.1  Construct validity	</w:t>
+      </w:r>
+      <w:r>
+        <w:rPr>
+          <w:sz w:val="19"/>
+        </w:rPr>
+        <w:t xml:space="preserve">4</w:t>
+      </w:r>
+    </w:p>
+    <w:p>
+      <w:pPr>
+        <w:tabs>
+          <w:tab w:val="right" w:leader="dot" w:pos="9350"/>
+        </w:tabs>
+        <w:rPr>
+          <w:sz w:val="19"/>
+        </w:rPr>
+      </w:pPr>
+      <w:r>
+        <w:rPr>
+          <w:sz w:val="19"/>
+        </w:rPr>
+        <w:t xml:space="preserve">6.2  Internal validity	</w:t>
+      </w:r>
+      <w:r>
+        <w:rPr>
+          <w:sz w:val="19"/>
+        </w:rPr>
+        <w:t xml:space="preserve">4</w:t>
+      </w:r>
+    </w:p>
+    <w:p>
+      <w:pPr>
+        <w:tabs>
+          <w:tab w:val="right" w:leader="dot" w:pos="9350"/>
+        </w:tabs>
+        <w:rPr>
+          <w:sz w:val="19"/>
+        </w:rPr>
+      </w:pPr>
+      <w:r>
+        <w:rPr>
+          <w:sz w:val="19"/>
+        </w:rPr>
+        <w:t xml:space="preserve">6.3  External validity	</w:t>
+      </w:r>
+      <w:r>
+        <w:rPr>
+          <w:sz w:val="19"/>
+        </w:rPr>
+        <w:t xml:space="preserve">4</w:t>
+      </w:r>
+    </w:p>
+    <w:p>
+      <w:pPr>
+        <w:tabs>
+          <w:tab w:val="right" w:leader="dot" w:pos="9350"/>
+        </w:tabs>
+        <w:rPr>
+          <w:sz w:val="19"/>
+        </w:rPr>
+      </w:pPr>
+      <w:r>
+        <w:rPr>
+          <w:sz w:val="19"/>
+        </w:rPr>
+        <w:t xml:space="preserve">6.4  Conclusion validity	</w:t>
+      </w:r>
+      <w:r>
+        <w:rPr>
+          <w:sz w:val="19"/>
+        </w:rPr>
+        <w:t xml:space="preserve">4</w:t>
+      </w:r>
+    </w:p>
+    <w:p>
+      <w:pPr>
+        <w:tabs>
+          <w:tab w:val="right" w:leader="dot" w:pos="9350"/>
+        </w:tabs>
+        <w:rPr>
+          <w:sz w:val="19"/>
+        </w:rPr>
+      </w:pPr>
+      <w:r>
+        <w:rPr>
+          <w:sz w:val="19"/>
+        </w:rPr>
+        <w:t xml:space="preserve">7  Conclusion and future work	</w:t>
+      </w:r>
+      <w:r>
+        <w:rPr>
+          <w:sz w:val="19"/>
+        </w:rPr>
+        <w:t xml:space="preserve">4</w:t>
+      </w:r>
+    </w:p>
+    <w:p>
+      <w:pPr>
+        <w:tabs>
+          <w:tab w:val="right" w:leader="dot" w:pos="9350"/>
+        </w:tabs>
+        <w:rPr>
+          <w:sz w:val="19"/>
+        </w:rPr>
+      </w:pPr>
+      <w:r>
+        <w:rPr>
+          <w:sz w:val="19"/>
+        </w:rPr>
+        <w:t xml:space="preserve">7.1  Summary	</w:t>
+      </w:r>
+      <w:r>
+        <w:rPr>
+          <w:sz w:val="19"/>
+        </w:rPr>
+        <w:t xml:space="preserve">4</w:t>
+      </w:r>
+    </w:p>
+    <w:p>
+      <w:pPr>
+        <w:tabs>
+          <w:tab w:val="right" w:leader="dot" w:pos="9350"/>
+        </w:tabs>
+        <w:rPr>
+          <w:sz w:val="19"/>
+        </w:rPr>
+      </w:pPr>
+      <w:r>
+        <w:rPr>
+          <w:sz w:val="19"/>
+        </w:rPr>
+        <w:t xml:space="preserve">7.2  Future work	</w:t>
+      </w:r>
+      <w:r>
+        <w:rPr>
+          <w:sz w:val="19"/>
+        </w:rPr>
+        <w:t xml:space="preserve">4</w:t>
+      </w:r>
+    </w:p>
+    <w:p>
+      <w:pPr>
+        <w:tabs>
+          <w:tab w:val="right" w:leader="dot" w:pos="9350"/>
+        </w:tabs>
+        <w:rPr>
+          <w:sz w:val="19"/>
+        </w:rPr>
+      </w:pPr>
+      <w:r>
+        <w:rPr>
+          <w:sz w:val="19"/>
+        </w:rPr>
+        <w:t xml:space="preserve">Data availability	</w:t>
+      </w:r>
+      <w:r>
+        <w:rPr>
+          <w:sz w:val="19"/>
+        </w:rPr>
+        <w:t xml:space="preserve">4</w:t>
+      </w:r>
+    </w:p>
+    <w:p>
+      <w:pPr>
+        <w:tabs>
+          <w:tab w:val="right" w:leader="dot" w:pos="9350"/>
+        </w:tabs>
+        <w:rPr>
+          <w:sz w:val="19"/>
+        </w:rPr>
+      </w:pPr>
+      <w:r>
+        <w:rPr>
+          <w:sz w:val="19"/>
+        </w:rPr>
+        <w:t xml:space="preserve">Acknowledgments	</w:t>
+      </w:r>
+      <w:r>
+        <w:rPr>
+          <w:sz w:val="19"/>
+        </w:rPr>
+        <w:t xml:space="preserve">4</w:t>
+      </w:r>
+    </w:p>
+    <w:p>
+      <w:pPr>
+        <w:tabs>
+          <w:tab w:val="right" w:leader="dot" w:pos="9350"/>
+        </w:tabs>
+        <w:rPr>
+          <w:sz w:val="19"/>
+        </w:rPr>
+      </w:pPr>
+      <w:r>
+        <w:rPr>
+          <w:sz w:val="19"/>
+        </w:rPr>
+        <w:t xml:space="preserve">Author contributions	</w:t>
+      </w:r>
+      <w:r>
+        <w:rPr>
+          <w:sz w:val="19"/>
+        </w:rPr>
+        <w:t xml:space="preserve">4</w:t>
+      </w:r>
+    </w:p>
+    <w:p>
+      <w:pPr>
+        <w:tabs>
+          <w:tab w:val="right" w:leader="dot" w:pos="9350"/>
+        </w:tabs>
+        <w:rPr>
+          <w:sz w:val="19"/>
+        </w:rPr>
+      </w:pPr>
+      <w:r>
+        <w:rPr>
+          <w:sz w:val="19"/>
+        </w:rPr>
+        <w:t xml:space="preserve">References	</w:t>
+      </w:r>
+      <w:r>
+        <w:rPr>
+          <w:sz w:val="19"/>
+        </w:rPr>
+        <w:t xml:space="preserve">4</w:t>
+      </w:r>
+    </w:p>
+    <w:p>
+      <w:pPr>
+        <w:tabs>
+          <w:tab w:val="right" w:leader="dot" w:pos="9350"/>
+        </w:tabs>
+        <w:rPr>
+          <w:sz w:val="19"/>
+        </w:rPr>
+      </w:pPr>
+      <w:r>
+        <w:rPr>
+          <w:sz w:val="19"/>
+        </w:rPr>
+        <w:t xml:space="preserve">Appendix A: Task catalog	</w:t>
+      </w:r>
+      <w:r>
+        <w:rPr>
+          <w:sz w:val="19"/>
+        </w:rPr>
+        <w:t xml:space="preserve">5</w:t>
+      </w:r>
+    </w:p>
+    <w:p>
+      <w:pPr>
+        <w:tabs>
+          <w:tab w:val="right" w:leader="dot" w:pos="9350"/>
+        </w:tabs>
+        <w:rPr>
+          <w:sz w:val="19"/>
+        </w:rPr>
+      </w:pPr>
+      <w:r>
+        <w:rPr>
+          <w:sz w:val="19"/>
+        </w:rPr>
+        <w:t xml:space="preserve">Appendix B: Per-condition static metrics	</w:t>
+      </w:r>
+      <w:r>
+        <w:rPr>
+          <w:sz w:val="19"/>
+        </w:rPr>
+        <w:t xml:space="preserve">5</w:t>
+      </w:r>
+    </w:p>
+    <w:p>
+      <w:pPr>
+        <w:tabs>
+          <w:tab w:val="right" w:leader="dot" w:pos="9350"/>
+        </w:tabs>
+        <w:rPr>
+          <w:sz w:val="19"/>
+        </w:rPr>
+      </w:pPr>
+      <w:r>
+        <w:rPr>
+          <w:sz w:val="19"/>
+        </w:rPr>
+        <w:t xml:space="preserve">Appendix C: Metric glossary	</w:t>
+      </w:r>
+      <w:r>
+        <w:rPr>
+          <w:sz w:val="19"/>
+        </w:rPr>
+        <w:t xml:space="preserve">5</w:t>
+      </w:r>
+    </w:p>
+    <w:p>
+      <w:pPr>
+        <w:tabs>
+          <w:tab w:val="right" w:leader="dot" w:pos="9350"/>
+        </w:tabs>
+        <w:rPr>
+          <w:sz w:val="19"/>
+        </w:rPr>
+      </w:pPr>
+      <w:r>
+        <w:rPr>
+          <w:sz w:val="19"/>
+        </w:rPr>
+        <w:t xml:space="preserve">Appendix D: Failure taxonomy	</w:t>
+      </w:r>
+      <w:r>
+        <w:rPr>
+          <w:sz w:val="19"/>
+        </w:rPr>
+        <w:t xml:space="preserve">5</w:t>
+      </w:r>
+    </w:p>
+    <w:p>
+      <w:pPr>
+        <w:tabs>
+          <w:tab w:val="right" w:leader="dot" w:pos="9350"/>
+        </w:tabs>
+        <w:rPr>
+          <w:sz w:val="19"/>
+        </w:rPr>
+      </w:pPr>
+      <w:r>
+        <w:rPr>
+          <w:sz w:val="19"/>
+        </w:rPr>
+        <w:t xml:space="preserve">Appendix E: Reproduction commands	</w:t>
+      </w:r>
+      <w:r>
+        <w:rPr>
+          <w:sz w:val="19"/>
+        </w:rPr>
+        <w:t xml:space="preserve">5</w:t>
+      </w:r>
+    </w:p>
+    <w:p>
+      <w:pPr>
+        <w:tabs>
+          <w:tab w:val="right" w:leader="dot" w:pos="9350"/>
+        </w:tabs>
+        <w:rPr>
+          <w:sz w:val="19"/>
+        </w:rPr>
+      </w:pPr>
+      <w:r>
+        <w:rPr>
+          <w:sz w:val="19"/>
+        </w:rPr>
+        <w:t xml:space="preserve">Index	</w:t>
+      </w:r>
+      <w:r>
+        <w:rPr>
+          <w:sz w:val="19"/>
+        </w:rPr>
+        <w:t xml:space="preserve">5</w:t>
+      </w:r>
+    </w:p>
+    <w:p>
+      <w:r>
+        <w:rPr>
+          <w:vanish/>
+        </w:rPr>
+        <w:t>STATIC-LIST-toc-END static snapshot from this build's pagination (Word: delete block + F9 to refresh)</w:t>
       </w:r>
     </w:p>
     <w:p>
@@ -428,8 +1874,288 @@
         <w:fldChar w:fldCharType="begin"/>
         <w:instrText xml:space="preserve">TOC \h \z \c "Figure"</w:instrText>
         <w:fldChar w:fldCharType="separate"/>
-        <w:t>Right-click → Update Field to build the list of figures.</w:t>
+        <w:t/>
         <w:fldChar w:fldCharType="end"/>
+      </w:r>
+    </w:p>
+    <w:p>
+      <w:r>
+        <w:rPr>
+          <w:vanish/>
+        </w:rPr>
+        <w:t>STATIC-LIST-lof-BEGIN</w:t>
+      </w:r>
+    </w:p>
+    <w:p>
+      <w:pPr>
+        <w:tabs>
+          <w:tab w:val="right" w:leader="dot" w:pos="9350"/>
+        </w:tabs>
+        <w:rPr>
+          <w:sz w:val="19"/>
+        </w:rPr>
+      </w:pPr>
+      <w:r>
+        <w:rPr>
+          <w:sz w:val="19"/>
+        </w:rPr>
+        <w:t xml:space="preserve">Figure 1. Energy distribution by interaction condition (box plot). Multi-turn shifts the median up and thickens the upper tail.	</w:t>
+      </w:r>
+      <w:r>
+        <w:rPr>
+          <w:sz w:val="19"/>
+        </w:rPr>
+        <w:t xml:space="preserve">12</w:t>
+      </w:r>
+    </w:p>
+    <w:p>
+      <w:pPr>
+        <w:tabs>
+          <w:tab w:val="right" w:leader="dot" w:pos="9350"/>
+        </w:tabs>
+        <w:rPr>
+          <w:sz w:val="19"/>
+        </w:rPr>
+      </w:pPr>
+      <w:r>
+        <w:rPr>
+          <w:sz w:val="19"/>
+        </w:rPr>
+        <w:t xml:space="preserve">Figure 2. Median energy by condition. The C0→C4 step is the largest single increase.	</w:t>
+      </w:r>
+      <w:r>
+        <w:rPr>
+          <w:sz w:val="19"/>
+        </w:rPr>
+        <w:t xml:space="preserve">12</w:t>
+      </w:r>
+    </w:p>
+    <w:p>
+      <w:pPr>
+        <w:tabs>
+          <w:tab w:val="right" w:leader="dot" w:pos="9350"/>
+        </w:tabs>
+        <w:rPr>
+          <w:sz w:val="19"/>
+        </w:rPr>
+      </w:pPr>
+      <w:r>
+        <w:rPr>
+          <w:sz w:val="19"/>
+        </w:rPr>
+        <w:t xml:space="preserve">Figure 3. Paired per-program energy change (ΔE %) versus one-shot, by condition.	</w:t>
+      </w:r>
+      <w:r>
+        <w:rPr>
+          <w:sz w:val="19"/>
+        </w:rPr>
+        <w:t xml:space="preserve">13</w:t>
+      </w:r>
+    </w:p>
+    <w:p>
+      <w:pPr>
+        <w:tabs>
+          <w:tab w:val="right" w:leader="dot" w:pos="9350"/>
+        </w:tabs>
+        <w:rPr>
+          <w:sz w:val="19"/>
+        </w:rPr>
+      </w:pPr>
+      <w:r>
+        <w:rPr>
+          <w:sz w:val="19"/>
+        </w:rPr>
+        <w:t xml:space="preserve">Figure 4. Paired scatter: one-shot versus full multi-turn energy per (task, model). Points above the diagonal cost more after the full trajectory.	</w:t>
+      </w:r>
+      <w:r>
+        <w:rPr>
+          <w:sz w:val="19"/>
+        </w:rPr>
+        <w:t xml:space="preserve">14</w:t>
+      </w:r>
+    </w:p>
+    <w:p>
+      <w:pPr>
+        <w:tabs>
+          <w:tab w:val="right" w:leader="dot" w:pos="9350"/>
+        </w:tabs>
+        <w:rPr>
+          <w:sz w:val="19"/>
+        </w:rPr>
+      </w:pPr>
+      <w:r>
+        <w:rPr>
+          <w:sz w:val="19"/>
+        </w:rPr>
+        <w:t xml:space="preserve">Figure 5. Energy by condition, faceted by model. Direction is consistent; magnitude varies.	</w:t>
+      </w:r>
+      <w:r>
+        <w:rPr>
+          <w:sz w:val="19"/>
+        </w:rPr>
+        <w:t xml:space="preserve">15</w:t>
+      </w:r>
+    </w:p>
+    <w:p>
+      <w:pPr>
+        <w:tabs>
+          <w:tab w:val="right" w:leader="dot" w:pos="9350"/>
+        </w:tabs>
+        <w:rPr>
+          <w:sz w:val="19"/>
+        </w:rPr>
+      </w:pPr>
+      <w:r>
+        <w:rPr>
+          <w:sz w:val="19"/>
+        </w:rPr>
+        <w:t xml:space="preserve">Figure 6. Mean energy change versus one-shot by task category.	</w:t>
+      </w:r>
+      <w:r>
+        <w:rPr>
+          <w:sz w:val="19"/>
+        </w:rPr>
+        <w:t xml:space="preserve">16</w:t>
+      </w:r>
+    </w:p>
+    <w:p>
+      <w:pPr>
+        <w:tabs>
+          <w:tab w:val="right" w:leader="dot" w:pos="9350"/>
+        </w:tabs>
+        <w:rPr>
+          <w:sz w:val="19"/>
+        </w:rPr>
+      </w:pPr>
+      <w:r>
+        <w:rPr>
+          <w:sz w:val="19"/>
+        </w:rPr>
+        <w:t xml:space="preserve">Figure 7. Runtime versus package energy (log–log). Energy is runtime-dominated; the C4 cloud extends to longer runtimes.	</w:t>
+      </w:r>
+      <w:r>
+        <w:rPr>
+          <w:sz w:val="19"/>
+        </w:rPr>
+        <w:t xml:space="preserve">16</w:t>
+      </w:r>
+    </w:p>
+    <w:p>
+      <w:pPr>
+        <w:tabs>
+          <w:tab w:val="right" w:leader="dot" w:pos="9350"/>
+        </w:tabs>
+        <w:rPr>
+          <w:sz w:val="19"/>
+        </w:rPr>
+      </w:pPr>
+      <w:r>
+        <w:rPr>
+          <w:sz w:val="19"/>
+        </w:rPr>
+        <w:t xml:space="preserve">Figure 8. SLOC distribution by condition. C4 programs are markedly longer (median 98.5 vs 58 SLOC).	</w:t>
+      </w:r>
+      <w:r>
+        <w:rPr>
+          <w:sz w:val="19"/>
+        </w:rPr>
+        <w:t xml:space="preserve">17</w:t>
+      </w:r>
+    </w:p>
+    <w:p>
+      <w:pPr>
+        <w:tabs>
+          <w:tab w:val="right" w:leader="dot" w:pos="9350"/>
+        </w:tabs>
+        <w:rPr>
+          <w:sz w:val="19"/>
+        </w:rPr>
+      </w:pPr>
+      <w:r>
+        <w:rPr>
+          <w:sz w:val="19"/>
+        </w:rPr>
+        <w:t xml:space="preserve">Figure 9. Estimated complexity-class mix by condition. Quadratic-plus share is stable (~47–48%); C4 adds SLOC without shifting the class mix.	</w:t>
+      </w:r>
+      <w:r>
+        <w:rPr>
+          <w:sz w:val="19"/>
+        </w:rPr>
+        <w:t xml:space="preserve">18</w:t>
+      </w:r>
+    </w:p>
+    <w:p>
+      <w:pPr>
+        <w:tabs>
+          <w:tab w:val="right" w:leader="dot" w:pos="9350"/>
+        </w:tabs>
+        <w:rPr>
+          <w:sz w:val="19"/>
+        </w:rPr>
+      </w:pPr>
+      <w:r>
+        <w:rPr>
+          <w:sz w:val="19"/>
+        </w:rPr>
+        <w:t xml:space="preserve">Figure 10. Empirical growth-exponent (log–log slope) distribution. Most programs scale near-linearly; the superlinear tail is small.	</w:t>
+      </w:r>
+      <w:r>
+        <w:rPr>
+          <w:sz w:val="19"/>
+        </w:rPr>
+        <w:t xml:space="preserve">19</w:t>
+      </w:r>
+    </w:p>
+    <w:p>
+      <w:pPr>
+        <w:tabs>
+          <w:tab w:val="right" w:leader="dot" w:pos="9350"/>
+        </w:tabs>
+        <w:rPr>
+          <w:sz w:val="19"/>
+        </w:rPr>
+      </w:pPr>
+      <w:r>
+        <w:rPr>
+          <w:sz w:val="19"/>
+        </w:rPr>
+        <w:t xml:space="preserve">Figure 11. Carbon-equivalent by condition across grid intensities. Rankings are intensity-invariant.	</w:t>
+      </w:r>
+      <w:r>
+        <w:rPr>
+          <w:sz w:val="19"/>
+        </w:rPr>
+        <w:t xml:space="preserve">20</w:t>
+      </w:r>
+    </w:p>
+    <w:p>
+      <w:pPr>
+        <w:tabs>
+          <w:tab w:val="right" w:leader="dot" w:pos="9350"/>
+        </w:tabs>
+        <w:rPr>
+          <w:sz w:val="19"/>
+        </w:rPr>
+      </w:pPr>
+      <w:r>
+        <w:rPr>
+          <w:sz w:val="19"/>
+        </w:rPr>
+        <w:t xml:space="preserve">Figure 12. Unmeasured-unit rate by condition. Full multi-turn fails most often — complexity has a correctness cost too.	</w:t>
+      </w:r>
+      <w:r>
+        <w:rPr>
+          <w:sz w:val="19"/>
+        </w:rPr>
+        <w:t xml:space="preserve">21</w:t>
+      </w:r>
+    </w:p>
+    <w:p>
+      <w:r>
+        <w:rPr>
+          <w:vanish/>
+        </w:rPr>
+        <w:t>STATIC-LIST-lof-END static snapshot from this build's pagination (Word: delete block + F9 to refresh)</w:t>
       </w:r>
     </w:p>
     <w:p>
@@ -448,8 +2174,486 @@
         <w:fldChar w:fldCharType="begin"/>
         <w:instrText xml:space="preserve">TOC \h \z \c "Table"</w:instrText>
         <w:fldChar w:fldCharType="separate"/>
-        <w:t>Right-click → Update Field to build the list of tables.</w:t>
+        <w:t/>
         <w:fldChar w:fldCharType="end"/>
+      </w:r>
+    </w:p>
+    <w:p>
+      <w:r>
+        <w:rPr>
+          <w:vanish/>
+        </w:rPr>
+        <w:t>STATIC-LIST-lot-BEGIN</w:t>
+      </w:r>
+    </w:p>
+    <w:p>
+      <w:pPr>
+        <w:tabs>
+          <w:tab w:val="right" w:leader="dot" w:pos="9350"/>
+        </w:tabs>
+        <w:rPr>
+          <w:sz w:val="19"/>
+        </w:rPr>
+      </w:pPr>
+      <w:r>
+        <w:rPr>
+          <w:sz w:val="19"/>
+        </w:rPr>
+        <w:t xml:space="preserve">Table 1. Task categories and program coverage (from code_metrics.csv and dataset/*/dataset.json).	</w:t>
+      </w:r>
+      <w:r>
+        <w:rPr>
+          <w:sz w:val="19"/>
+        </w:rPr>
+        <w:t xml:space="preserve">9</w:t>
+      </w:r>
+    </w:p>
+    <w:p>
+      <w:pPr>
+        <w:tabs>
+          <w:tab w:val="right" w:leader="dot" w:pos="9350"/>
+        </w:tabs>
+        <w:rPr>
+          <w:sz w:val="19"/>
+        </w:rPr>
+      </w:pPr>
+      <w:r>
+        <w:rPr>
+          <w:sz w:val="19"/>
+        </w:rPr>
+        <w:t xml:space="preserve">Table 2. Interaction conditions. Paired tests compare C1–C4 against C0 within (task, model).	</w:t>
+      </w:r>
+      <w:r>
+        <w:rPr>
+          <w:sz w:val="19"/>
+        </w:rPr>
+        <w:t xml:space="preserve">9</w:t>
+      </w:r>
+    </w:p>
+    <w:p>
+      <w:pPr>
+        <w:tabs>
+          <w:tab w:val="right" w:leader="dot" w:pos="9350"/>
+        </w:tabs>
+        <w:rPr>
+          <w:sz w:val="19"/>
+        </w:rPr>
+      </w:pPr>
+      <w:r>
+        <w:rPr>
+          <w:sz w:val="19"/>
+        </w:rPr>
+        <w:t xml:space="preserve">Table 3. Programs per model (from code_metrics.csv).	</w:t>
+      </w:r>
+      <w:r>
+        <w:rPr>
+          <w:sz w:val="19"/>
+        </w:rPr>
+        <w:t xml:space="preserve">9</w:t>
+      </w:r>
+    </w:p>
+    <w:p>
+      <w:pPr>
+        <w:tabs>
+          <w:tab w:val="right" w:leader="dot" w:pos="9350"/>
+        </w:tabs>
+        <w:rPr>
+          <w:sz w:val="19"/>
+        </w:rPr>
+      </w:pPr>
+      <w:r>
+        <w:rPr>
+          <w:sz w:val="19"/>
+        </w:rPr>
+        <w:t xml:space="preserve">Table 4. Static metric definitions (full glossary in Appendix C).	</w:t>
+      </w:r>
+      <w:r>
+        <w:rPr>
+          <w:sz w:val="19"/>
+        </w:rPr>
+        <w:t xml:space="preserve">10</w:t>
+      </w:r>
+    </w:p>
+    <w:p>
+      <w:pPr>
+        <w:tabs>
+          <w:tab w:val="right" w:leader="dot" w:pos="9350"/>
+        </w:tabs>
+        <w:rPr>
+          <w:sz w:val="19"/>
+        </w:rPr>
+      </w:pPr>
+      <w:r>
+        <w:rPr>
+          <w:sz w:val="19"/>
+        </w:rPr>
+        <w:t xml:space="preserve">Table 5. Static-estimator validation summary (from complexity_metrics.json).	</w:t>
+      </w:r>
+      <w:r>
+        <w:rPr>
+          <w:sz w:val="19"/>
+        </w:rPr>
+        <w:t xml:space="preserve">10</w:t>
+      </w:r>
+    </w:p>
+    <w:p>
+      <w:pPr>
+        <w:tabs>
+          <w:tab w:val="right" w:leader="dot" w:pos="9350"/>
+        </w:tabs>
+        <w:rPr>
+          <w:sz w:val="19"/>
+        </w:rPr>
+      </w:pPr>
+      <w:r>
+        <w:rPr>
+          <w:sz w:val="19"/>
+        </w:rPr>
+        <w:t xml:space="preserve">Table 6. Coverage by category (from code_metrics.csv).	</w:t>
+      </w:r>
+      <w:r>
+        <w:rPr>
+          <w:sz w:val="19"/>
+        </w:rPr>
+        <w:t xml:space="preserve">11</w:t>
+      </w:r>
+    </w:p>
+    <w:p>
+      <w:pPr>
+        <w:tabs>
+          <w:tab w:val="right" w:leader="dot" w:pos="9350"/>
+        </w:tabs>
+        <w:rPr>
+          <w:sz w:val="19"/>
+        </w:rPr>
+      </w:pPr>
+      <w:r>
+        <w:rPr>
+          <w:sz w:val="19"/>
+        </w:rPr>
+        <w:t xml:space="preserve">Table 7. Energy and runtime by interaction condition (from energy_report.json). Median rises monotonically C0→C4; the mean rises faster (heavy tail).	</w:t>
+      </w:r>
+      <w:r>
+        <w:rPr>
+          <w:sz w:val="19"/>
+        </w:rPr>
+        <w:t xml:space="preserve">11</w:t>
+      </w:r>
+    </w:p>
+    <w:p>
+      <w:pPr>
+        <w:tabs>
+          <w:tab w:val="right" w:leader="dot" w:pos="9350"/>
+        </w:tabs>
+        <w:rPr>
+          <w:sz w:val="19"/>
+        </w:rPr>
+      </w:pPr>
+      <w:r>
+        <w:rPr>
+          <w:sz w:val="19"/>
+        </w:rPr>
+        <w:t xml:space="preserve">Table 8. Paired energy change versus one-shot within (task, model). Only C4 is significant (p=0.006).	</w:t>
+      </w:r>
+      <w:r>
+        <w:rPr>
+          <w:sz w:val="19"/>
+        </w:rPr>
+        <w:t xml:space="preserve">12</w:t>
+      </w:r>
+    </w:p>
+    <w:p>
+      <w:pPr>
+        <w:tabs>
+          <w:tab w:val="right" w:leader="dot" w:pos="9350"/>
+        </w:tabs>
+        <w:rPr>
+          <w:sz w:val="19"/>
+        </w:rPr>
+      </w:pPr>
+      <w:r>
+        <w:rPr>
+          <w:sz w:val="19"/>
+        </w:rPr>
+        <w:t xml:space="preserve">Table 9. Mean energy (J) by condition and model (from energy_report.json).	</w:t>
+      </w:r>
+      <w:r>
+        <w:rPr>
+          <w:sz w:val="19"/>
+        </w:rPr>
+        <w:t xml:space="preserve">14</w:t>
+      </w:r>
+    </w:p>
+    <w:p>
+      <w:pPr>
+        <w:tabs>
+          <w:tab w:val="right" w:leader="dot" w:pos="9350"/>
+        </w:tabs>
+        <w:rPr>
+          <w:sz w:val="19"/>
+        </w:rPr>
+      </w:pPr>
+      <w:r>
+        <w:rPr>
+          <w:sz w:val="19"/>
+        </w:rPr>
+        <w:t xml:space="preserve">Table 10. Energy change by category (from energy_report.json).	</w:t>
+      </w:r>
+      <w:r>
+        <w:rPr>
+          <w:sz w:val="19"/>
+        </w:rPr>
+        <w:t xml:space="preserve">15</w:t>
+      </w:r>
+    </w:p>
+    <w:p>
+      <w:pPr>
+        <w:tabs>
+          <w:tab w:val="right" w:leader="dot" w:pos="9350"/>
+        </w:tabs>
+        <w:rPr>
+          <w:sz w:val="19"/>
+        </w:rPr>
+      </w:pPr>
+      <w:r>
+        <w:rPr>
+          <w:sz w:val="19"/>
+        </w:rPr>
+        <w:t xml:space="preserve">Table 11. Static metrics by condition (from complexity_metrics.json). Size and branching grow monotonically C0→C4.	</w:t>
+      </w:r>
+      <w:r>
+        <w:rPr>
+          <w:sz w:val="19"/>
+        </w:rPr>
+        <w:t xml:space="preserve">16</w:t>
+      </w:r>
+    </w:p>
+    <w:p>
+      <w:pPr>
+        <w:tabs>
+          <w:tab w:val="right" w:leader="dot" w:pos="9350"/>
+        </w:tabs>
+        <w:rPr>
+          <w:sz w:val="19"/>
+        </w:rPr>
+      </w:pPr>
+      <w:r>
+        <w:rPr>
+          <w:sz w:val="19"/>
+        </w:rPr>
+        <w:t xml:space="preserve">Table 12. Estimated time-complexity class distribution (n=1471, from complexity_metrics.json).	</w:t>
+      </w:r>
+      <w:r>
+        <w:rPr>
+          <w:sz w:val="19"/>
+        </w:rPr>
+        <w:t xml:space="preserve">17</w:t>
+      </w:r>
+    </w:p>
+    <w:p>
+      <w:pPr>
+        <w:tabs>
+          <w:tab w:val="right" w:leader="dot" w:pos="9350"/>
+        </w:tabs>
+        <w:rPr>
+          <w:sz w:val="19"/>
+        </w:rPr>
+      </w:pPr>
+      <w:r>
+        <w:rPr>
+          <w:sz w:val="19"/>
+        </w:rPr>
+        <w:t xml:space="preserve">Table 13. Agreement matrix, static estimator vs empirical slope (n=61, precision=0.212, recall=0.875).	</w:t>
+      </w:r>
+      <w:r>
+        <w:rPr>
+          <w:sz w:val="19"/>
+        </w:rPr>
+        <w:t xml:space="preserve">18</w:t>
+      </w:r>
+    </w:p>
+    <w:p>
+      <w:pPr>
+        <w:tabs>
+          <w:tab w:val="right" w:leader="dot" w:pos="9350"/>
+        </w:tabs>
+        <w:rPr>
+          <w:sz w:val="19"/>
+        </w:rPr>
+      </w:pPr>
+      <w:r>
+        <w:rPr>
+          <w:sz w:val="19"/>
+        </w:rPr>
+        <w:t xml:space="preserve">Table 14. Cross-metric correlations on measured programs (from complexity_summary.json).	</w:t>
+      </w:r>
+      <w:r>
+        <w:rPr>
+          <w:sz w:val="19"/>
+        </w:rPr>
+        <w:t xml:space="preserve">19</w:t>
+      </w:r>
+    </w:p>
+    <w:p>
+      <w:pPr>
+        <w:tabs>
+          <w:tab w:val="right" w:leader="dot" w:pos="9350"/>
+        </w:tabs>
+        <w:rPr>
+          <w:sz w:val="19"/>
+        </w:rPr>
+      </w:pPr>
+      <w:r>
+        <w:rPr>
+          <w:sz w:val="19"/>
+        </w:rPr>
+        <w:t xml:space="preserve">Table 15. Carbon sensitivity by grid intensity (from carbon_report.json).	</w:t>
+      </w:r>
+      <w:r>
+        <w:rPr>
+          <w:sz w:val="19"/>
+        </w:rPr>
+        <w:t xml:space="preserve">19</w:t>
+      </w:r>
+    </w:p>
+    <w:p>
+      <w:pPr>
+        <w:tabs>
+          <w:tab w:val="right" w:leader="dot" w:pos="9350"/>
+        </w:tabs>
+        <w:rPr>
+          <w:sz w:val="19"/>
+        </w:rPr>
+      </w:pPr>
+      <w:r>
+        <w:rPr>
+          <w:sz w:val="19"/>
+        </w:rPr>
+        <w:t xml:space="preserve">Table 16. Unmeasured units by reason (from energy_failures.csv).	</w:t>
+      </w:r>
+      <w:r>
+        <w:rPr>
+          <w:sz w:val="19"/>
+        </w:rPr>
+        <w:t xml:space="preserve">20</w:t>
+      </w:r>
+    </w:p>
+    <w:p>
+      <w:pPr>
+        <w:tabs>
+          <w:tab w:val="right" w:leader="dot" w:pos="9350"/>
+        </w:tabs>
+        <w:rPr>
+          <w:sz w:val="19"/>
+        </w:rPr>
+      </w:pPr>
+      <w:r>
+        <w:rPr>
+          <w:sz w:val="19"/>
+        </w:rPr>
+        <w:t xml:space="preserve">Table 17. Unmeasured units by category.	</w:t>
+      </w:r>
+      <w:r>
+        <w:rPr>
+          <w:sz w:val="19"/>
+        </w:rPr>
+        <w:t xml:space="preserve">20</w:t>
+      </w:r>
+    </w:p>
+    <w:p>
+      <w:pPr>
+        <w:tabs>
+          <w:tab w:val="right" w:leader="dot" w:pos="9350"/>
+        </w:tabs>
+        <w:rPr>
+          <w:sz w:val="19"/>
+        </w:rPr>
+      </w:pPr>
+      <w:r>
+        <w:rPr>
+          <w:sz w:val="19"/>
+        </w:rPr>
+        <w:t xml:space="preserve">Table 18. Full task catalog (from dataset/*/dataset.json).	</w:t>
+      </w:r>
+      <w:r>
+        <w:rPr>
+          <w:sz w:val="19"/>
+        </w:rPr>
+        <w:t xml:space="preserve">25</w:t>
+      </w:r>
+    </w:p>
+    <w:p>
+      <w:pPr>
+        <w:tabs>
+          <w:tab w:val="right" w:leader="dot" w:pos="9350"/>
+        </w:tabs>
+        <w:rPr>
+          <w:sz w:val="19"/>
+        </w:rPr>
+      </w:pPr>
+      <w:r>
+        <w:rPr>
+          <w:sz w:val="19"/>
+        </w:rPr>
+        <w:t xml:space="preserve">Table 19. Static metrics per condition (from complexity_metrics.json).	</w:t>
+      </w:r>
+      <w:r>
+        <w:rPr>
+          <w:sz w:val="19"/>
+        </w:rPr>
+        <w:t xml:space="preserve">29</w:t>
+      </w:r>
+    </w:p>
+    <w:p>
+      <w:pPr>
+        <w:tabs>
+          <w:tab w:val="right" w:leader="dot" w:pos="9350"/>
+        </w:tabs>
+        <w:rPr>
+          <w:sz w:val="19"/>
+        </w:rPr>
+      </w:pPr>
+      <w:r>
+        <w:rPr>
+          <w:sz w:val="19"/>
+        </w:rPr>
+        <w:t xml:space="preserve">Table 20. Glossary of tracked metrics.	</w:t>
+      </w:r>
+      <w:r>
+        <w:rPr>
+          <w:sz w:val="19"/>
+        </w:rPr>
+        <w:t xml:space="preserve">29</w:t>
+      </w:r>
+    </w:p>
+    <w:p>
+      <w:pPr>
+        <w:tabs>
+          <w:tab w:val="right" w:leader="dot" w:pos="9350"/>
+        </w:tabs>
+        <w:rPr>
+          <w:sz w:val="19"/>
+        </w:rPr>
+      </w:pPr>
+      <w:r>
+        <w:rPr>
+          <w:sz w:val="19"/>
+        </w:rPr>
+        <w:t xml:space="preserve">Table 21. Failure taxonomy (from energy_failures.csv).	</w:t>
+      </w:r>
+      <w:r>
+        <w:rPr>
+          <w:sz w:val="19"/>
+        </w:rPr>
+        <w:t xml:space="preserve">29</w:t>
+      </w:r>
+    </w:p>
+    <w:p>
+      <w:r>
+        <w:rPr>
+          <w:vanish/>
+        </w:rPr>
+        <w:t>STATIC-LIST-lot-END static snapshot from this build's pagination (Word: delete block + F9 to refresh)</w:t>
       </w:r>
     </w:p>
     <w:p>
@@ -726,7 +2930,7 @@
           <w:b w:val="0"/>
           <w:i w:val="0"/>
         </w:rPr>
-        <w:t>HumanEval (Chen et al.), MBPP (Austin et al.), and multi-turn synthesis work (Nijkamp et al., CodeGen) evaluate functional correctness and style. Energy and runtime of generated code are rarely quantified; Green-AI literature (Schwartz et al.; Patterson et al.; Strubell et al.) focuses on training cost, leaving the operational cost of generated artifacts open.</w:t>
+        <w:t>HumanEval (Chen et al.), MBPP (Austin et al.), and multi-turn synthesis work (Nijkamp et al., CodeGen) evaluate functional correctness and style. Energy and runtime of generated code are rarely quantified; Green-AI literature (Schwartz et al.; Patterson et al.; Strubell et al.) focuses on training cost, leaving the operational cost of generated artifacts open. The closest prior, Di Bernardo et al. ('Do LLMs Dream of Energy-Efficient Code?', 812 Python programs on EffiBench tasks), shows LLM solutions trail human ones by ~50% and that explicit efficiency prompting worsens energy — but their workflow is generate-then-optimise, whereas ours measures energy as an unintended by-product of ordinary bug-fix/feature/edge-case interaction.</w:t>
       </w:r>
     </w:p>
     <w:p>
@@ -838,7 +3042,7 @@
           <w:b w:val="0"/>
           <w:i w:val="0"/>
         </w:rPr>
-        <w:t>The benchmark fixes the final specification of every task and varies only the interaction trajectory that produced the code. Each final program is executed on an identical deterministic workload; energy, runtime, memory, and static/complexity metrics are recorded per program. Figure 1 summarises the pipeline; Table 1 the task coverage.</w:t>
+        <w:t>The benchmark fixes the final specification of every task and varies only the interaction trajectory that produced the code. Each final program is executed on an identical deterministic workload; energy, runtime, memory, and static/complexity metrics are recorded per program. The box below summarises the pipeline; Table 1 lists the task coverage.</w:t>
       </w:r>
     </w:p>
     <w:tbl>
@@ -913,23 +3117,7 @@
           <w:i/>
           <w:sz w:val="18"/>
         </w:rPr>
-        <w:t xml:space="preserve">Table </w:t>
-      </w:r>
-      <w:r>
-        <w:fldChar w:fldCharType="begin"/>
-        <w:instrText xml:space="preserve"> SEQ Table</w:instrText>
-        <w:fldChar w:fldCharType="separate"/>
-        <w:fldChar w:fldCharType="end"/>
-      </w:r>
-      <w:r>
-        <w:t>1</w:t>
-      </w:r>
-      <w:r>
-        <w:rPr>
-          <w:i/>
-          <w:sz w:val="18"/>
-        </w:rPr>
-        <w:t>. Task categories and program coverage (from code_metrics.csv and dataset/*/dataset.json).</w:t>
+        <w:t>Table 1. Task categories and program coverage (from code_metrics.csv and dataset/*/dataset.json).</w:t>
       </w:r>
     </w:p>
     <w:tbl>
@@ -1442,6 +3630,18 @@
     </w:p>
     <w:p>
       <w:pPr>
+        <w:jc w:val="both"/>
+      </w:pPr>
+      <w:r>
+        <w:rPr>
+          <w:b w:val="0"/>
+          <w:i w:val="0"/>
+        </w:rPr>
+        <w:t>Task provenance: six team members authored 25 candidate tasks each (150 candidates), quality-checked for duplicates, clarity, and feasibility with per-category ownership; a pilot study validated prompts, trajectory separation, and measurement resolution before full collection. Conversations reset per cell; no manual repair.</w:t>
+      </w:r>
+    </w:p>
+    <w:p>
+      <w:pPr>
         <w:pStyle w:val="Heading2"/>
       </w:pPr>
       <w:r>
@@ -1472,23 +3672,7 @@
           <w:i/>
           <w:sz w:val="18"/>
         </w:rPr>
-        <w:t xml:space="preserve">Table </w:t>
-      </w:r>
-      <w:r>
-        <w:fldChar w:fldCharType="begin"/>
-        <w:instrText xml:space="preserve"> SEQ Table</w:instrText>
-        <w:fldChar w:fldCharType="separate"/>
-        <w:fldChar w:fldCharType="end"/>
-      </w:r>
-      <w:r>
-        <w:t>1</w:t>
-      </w:r>
-      <w:r>
-        <w:rPr>
-          <w:i/>
-          <w:sz w:val="18"/>
-        </w:rPr>
-        <w:t>. Interaction conditions. Paired tests compare C1–C4 against C0 within (task, model).</w:t>
+        <w:t>Table 2. Interaction conditions. Paired tests compare C1–C4 against C0 within (task, model).</w:t>
       </w:r>
     </w:p>
     <w:tbl>
@@ -1825,23 +4009,7 @@
           <w:i/>
           <w:sz w:val="18"/>
         </w:rPr>
-        <w:t xml:space="preserve">Table </w:t>
-      </w:r>
-      <w:r>
-        <w:fldChar w:fldCharType="begin"/>
-        <w:instrText xml:space="preserve"> SEQ Table</w:instrText>
-        <w:fldChar w:fldCharType="separate"/>
-        <w:fldChar w:fldCharType="end"/>
-      </w:r>
-      <w:r>
-        <w:t>1</w:t>
-      </w:r>
-      <w:r>
-        <w:rPr>
-          <w:i/>
-          <w:sz w:val="18"/>
-        </w:rPr>
-        <w:t>. Programs per model (from code_metrics.csv).</w:t>
+        <w:t>Table 3. Programs per model (from code_metrics.csv).</w:t>
       </w:r>
     </w:p>
     <w:tbl>
@@ -2121,7 +4289,7 @@
           <w:b w:val="0"/>
           <w:i w:val="0"/>
         </w:rPr>
-        <w:t>Each task ships a harness (tests/harness/&lt;cat&gt;/&lt;TASK&gt;.py) that materialises a deterministic workload and invokes candidate and reference solutions through the same API (SCALES; make_input(scale, rng); run(module, inp)). Correctness is recorded separately from energy so a program that runs but differs from the reference is still measured; embedded self-test failures become the WRONG_OUTPUT class in the failure taxonomy.</w:t>
+        <w:t>Each task ships a harness (tests/harness/&lt;cat&gt;/&lt;TASK&gt;.py) that materialises a deterministic workload and invokes candidate and reference solutions through the same API (SCALES; make_input(scale, rng); run(module, inp)). Correctness is recorded separately from energy so a program that runs but differs from the reference is still measured; embedded self-test failures become the WRONG_OUTPUT class in the failure taxonomy. Because programs invoke workloads heterogeneously (stdin, file args, argparse, self-contained), measurement uses adaptive invocation (CLI patterns tried until exit 0) plus workload aliasing (inputs served under every filename the program opens); an automated rescue pass recovered initially-unrunnable units.</w:t>
       </w:r>
     </w:p>
     <w:p>
@@ -2144,7 +4312,7 @@
           <w:b w:val="0"/>
           <w:i w:val="0"/>
         </w:rPr>
-        <w:t>Package energy is read from /sys/class/powercap/intel-rapl:0/energy_uj on a controlled Linux 6.19 / Python 3.13 / 8-CPU host. Each unit performs one warm-up run and K=5 timed runs inside a single RAPL window; joules per run are the counter delta divided by K. Timeouts are capped at 30 s per run. The ledger (results/energy_runs.jsonl, measurement_ledger.jsonl) is append-only and resumable by code hash.</w:t>
+        <w:t>Package energy is read from /sys/class/powercap/intel-rapl:0/energy_uj on a controlled, dedicated Linux host (Intel Core i5-8250U, 8 threads; CPython 3.13; no third-party dependencies in measured programs; fresh temporary directory per run). Timing uses time.perf_counter() and peak memory /usr/bin/time. Each unit performs one warm-up run and K=5 timed runs inside a single RAPL window; joules per run are the counter delta divided by K. Timeouts are capped at 30 s per run. The ledger (results/energy_runs.jsonl, measurement_ledger.jsonl) is append-only and resumable by code hash.</w:t>
       </w:r>
     </w:p>
     <w:tbl>
@@ -2186,7 +4354,7 @@
               <w:rPr>
                 <w:sz w:val="18"/>
               </w:rPr>
-              <w:t>Host (8 CPUs, intel-rapl:0 package + :0:0 core) → workload inputs (inputs/&lt;cat&gt;/&lt;task&gt;/&lt;scale&gt;/) → harness run (warm-up + 5 timed) → RAPL delta + /usr/bin/time peak memory → per-unit record (energy_pkg_j, energy_core_j, runtime_s, peak_mem_mb).</w:t>
+              <w:t>Host (Intel i5-8250U, 8 threads, intel-rapl:0 package) → workload inputs (inputs/&lt;cat&gt;/&lt;task&gt;/&lt;scale&gt;/) → harness run (warm-up + 5 timed) → RAPL delta + /usr/bin/time peak memory → per-unit record (energy_pkg_j, energy_core_j, runtime_s, peak_mem_mb).</w:t>
             </w:r>
           </w:p>
         </w:tc>
@@ -2254,23 +4422,7 @@
           <w:i/>
           <w:sz w:val="18"/>
         </w:rPr>
-        <w:t xml:space="preserve">Table </w:t>
-      </w:r>
-      <w:r>
-        <w:fldChar w:fldCharType="begin"/>
-        <w:instrText xml:space="preserve"> SEQ Table</w:instrText>
-        <w:fldChar w:fldCharType="separate"/>
-        <w:fldChar w:fldCharType="end"/>
-      </w:r>
-      <w:r>
-        <w:t>1</w:t>
-      </w:r>
-      <w:r>
-        <w:rPr>
-          <w:i/>
-          <w:sz w:val="18"/>
-        </w:rPr>
-        <w:t>. Static metric definitions (full glossary in Appendix C).</w:t>
+        <w:t>Table 4. Static metric definitions (full glossary in Appendix C).</w:t>
       </w:r>
     </w:p>
     <w:tbl>
@@ -2598,23 +4750,7 @@
           <w:i/>
           <w:sz w:val="18"/>
         </w:rPr>
-        <w:t xml:space="preserve">Table </w:t>
-      </w:r>
-      <w:r>
-        <w:fldChar w:fldCharType="begin"/>
-        <w:instrText xml:space="preserve"> SEQ Table</w:instrText>
-        <w:fldChar w:fldCharType="separate"/>
-        <w:fldChar w:fldCharType="end"/>
-      </w:r>
-      <w:r>
-        <w:t>1</w:t>
-      </w:r>
-      <w:r>
-        <w:rPr>
-          <w:i/>
-          <w:sz w:val="18"/>
-        </w:rPr>
-        <w:t>. Static-estimator validation summary (from complexity_metrics.json).</w:t>
+        <w:t>Table 5. Static-estimator validation summary (from complexity_metrics.json).</w:t>
       </w:r>
     </w:p>
     <w:tbl>
@@ -2928,23 +5064,7 @@
           <w:i/>
           <w:sz w:val="18"/>
         </w:rPr>
-        <w:t xml:space="preserve">Table </w:t>
-      </w:r>
-      <w:r>
-        <w:fldChar w:fldCharType="begin"/>
-        <w:instrText xml:space="preserve"> SEQ Table</w:instrText>
-        <w:fldChar w:fldCharType="separate"/>
-        <w:fldChar w:fldCharType="end"/>
-      </w:r>
-      <w:r>
-        <w:t>1</w:t>
-      </w:r>
-      <w:r>
-        <w:rPr>
-          <w:i/>
-          <w:sz w:val="18"/>
-        </w:rPr>
-        <w:t>. Coverage by category (from code_metrics.csv).</w:t>
+        <w:t>Table 6. Coverage by category (from code_metrics.csv).</w:t>
       </w:r>
     </w:p>
     <w:tbl>
@@ -3475,23 +5595,7 @@
           <w:i/>
           <w:sz w:val="18"/>
         </w:rPr>
-        <w:t xml:space="preserve">Table </w:t>
-      </w:r>
-      <w:r>
-        <w:fldChar w:fldCharType="begin"/>
-        <w:instrText xml:space="preserve"> SEQ Table</w:instrText>
-        <w:fldChar w:fldCharType="separate"/>
-        <w:fldChar w:fldCharType="end"/>
-      </w:r>
-      <w:r>
-        <w:t>1</w:t>
-      </w:r>
-      <w:r>
-        <w:rPr>
-          <w:i/>
-          <w:sz w:val="18"/>
-        </w:rPr>
-        <w:t>. Energy and runtime by interaction condition (from energy_report.json). Median rises monotonically C0→C4; the mean rises faster (heavy tail).</w:t>
+        <w:t>Table 7. Energy and runtime by interaction condition (from energy_report.json). Median rises monotonically C0→C4; the mean rises faster (heavy tail).</w:t>
       </w:r>
     </w:p>
     <w:tbl>
@@ -4021,23 +6125,7 @@
           <w:i/>
           <w:sz w:val="18"/>
         </w:rPr>
-        <w:t xml:space="preserve">Figure </w:t>
-      </w:r>
-      <w:r>
-        <w:fldChar w:fldCharType="begin"/>
-        <w:instrText xml:space="preserve"> SEQ Figure</w:instrText>
-        <w:fldChar w:fldCharType="separate"/>
-        <w:fldChar w:fldCharType="end"/>
-      </w:r>
-      <w:r>
-        <w:t>1</w:t>
-      </w:r>
-      <w:r>
-        <w:rPr>
-          <w:i/>
-          <w:sz w:val="18"/>
-        </w:rPr>
-        <w:t>. Energy distribution by interaction condition (box plot). Multi-turn shifts the median up and thickens the upper tail.</w:t>
+        <w:t>Figure 1. Energy distribution by interaction condition (box plot). Multi-turn shifts the median up and thickens the upper tail.</w:t>
       </w:r>
     </w:p>
     <w:p>
@@ -4089,23 +6177,7 @@
           <w:i/>
           <w:sz w:val="18"/>
         </w:rPr>
-        <w:t xml:space="preserve">Figure </w:t>
-      </w:r>
-      <w:r>
-        <w:fldChar w:fldCharType="begin"/>
-        <w:instrText xml:space="preserve"> SEQ Figure</w:instrText>
-        <w:fldChar w:fldCharType="separate"/>
-        <w:fldChar w:fldCharType="end"/>
-      </w:r>
-      <w:r>
-        <w:t>1</w:t>
-      </w:r>
-      <w:r>
-        <w:rPr>
-          <w:i/>
-          <w:sz w:val="18"/>
-        </w:rPr>
-        <w:t>. Median energy by condition. The C0→C4 step is the largest single increase.</w:t>
+        <w:t>Figure 2. Median energy by condition. The C0→C4 step is the largest single increase.</w:t>
       </w:r>
     </w:p>
     <w:p>
@@ -4140,23 +6212,7 @@
           <w:i/>
           <w:sz w:val="18"/>
         </w:rPr>
-        <w:t xml:space="preserve">Table </w:t>
-      </w:r>
-      <w:r>
-        <w:fldChar w:fldCharType="begin"/>
-        <w:instrText xml:space="preserve"> SEQ Table</w:instrText>
-        <w:fldChar w:fldCharType="separate"/>
-        <w:fldChar w:fldCharType="end"/>
-      </w:r>
-      <w:r>
-        <w:t>1</w:t>
-      </w:r>
-      <w:r>
-        <w:rPr>
-          <w:i/>
-          <w:sz w:val="18"/>
-        </w:rPr>
-        <w:t>. Paired energy change versus one-shot within (task, model). Only C4 is significant (p=0.006).</w:t>
+        <w:t>Table 8. Paired energy change versus one-shot within (task, model). Only C4 is significant (p=0.006).</w:t>
       </w:r>
     </w:p>
     <w:tbl>
@@ -4769,23 +6825,7 @@
           <w:i/>
           <w:sz w:val="18"/>
         </w:rPr>
-        <w:t xml:space="preserve">Figure </w:t>
-      </w:r>
-      <w:r>
-        <w:fldChar w:fldCharType="begin"/>
-        <w:instrText xml:space="preserve"> SEQ Figure</w:instrText>
-        <w:fldChar w:fldCharType="separate"/>
-        <w:fldChar w:fldCharType="end"/>
-      </w:r>
-      <w:r>
-        <w:t>1</w:t>
-      </w:r>
-      <w:r>
-        <w:rPr>
-          <w:i/>
-          <w:sz w:val="18"/>
-        </w:rPr>
-        <w:t>. Paired per-program energy change (ΔE %) versus one-shot, by condition.</w:t>
+        <w:t>Figure 3. Paired per-program energy change (ΔE %) versus one-shot, by condition.</w:t>
       </w:r>
     </w:p>
     <w:p>
@@ -4837,23 +6877,7 @@
           <w:i/>
           <w:sz w:val="18"/>
         </w:rPr>
-        <w:t xml:space="preserve">Figure </w:t>
-      </w:r>
-      <w:r>
-        <w:fldChar w:fldCharType="begin"/>
-        <w:instrText xml:space="preserve"> SEQ Figure</w:instrText>
-        <w:fldChar w:fldCharType="separate"/>
-        <w:fldChar w:fldCharType="end"/>
-      </w:r>
-      <w:r>
-        <w:t>1</w:t>
-      </w:r>
-      <w:r>
-        <w:rPr>
-          <w:i/>
-          <w:sz w:val="18"/>
-        </w:rPr>
-        <w:t>. Paired scatter: one-shot versus full multi-turn energy per (task, model). Points above the diagonal cost more after the full trajectory.</w:t>
+        <w:t>Figure 4. Paired scatter: one-shot versus full multi-turn energy per (task, model). Points above the diagonal cost more after the full trajectory.</w:t>
       </w:r>
     </w:p>
     <w:p>
@@ -4876,23 +6900,7 @@
           <w:i/>
           <w:sz w:val="18"/>
         </w:rPr>
-        <w:t xml:space="preserve">Table </w:t>
-      </w:r>
-      <w:r>
-        <w:fldChar w:fldCharType="begin"/>
-        <w:instrText xml:space="preserve"> SEQ Table</w:instrText>
-        <w:fldChar w:fldCharType="separate"/>
-        <w:fldChar w:fldCharType="end"/>
-      </w:r>
-      <w:r>
-        <w:t>1</w:t>
-      </w:r>
-      <w:r>
-        <w:rPr>
-          <w:i/>
-          <w:sz w:val="18"/>
-        </w:rPr>
-        <w:t>. Mean energy (J) by condition and model (from energy_report.json).</w:t>
+        <w:t>Table 9. Mean energy (J) by condition and model (from energy_report.json).</w:t>
       </w:r>
     </w:p>
     <w:tbl>
@@ -5497,23 +7505,7 @@
           <w:i/>
           <w:sz w:val="18"/>
         </w:rPr>
-        <w:t xml:space="preserve">Figure </w:t>
-      </w:r>
-      <w:r>
-        <w:fldChar w:fldCharType="begin"/>
-        <w:instrText xml:space="preserve"> SEQ Figure</w:instrText>
-        <w:fldChar w:fldCharType="separate"/>
-        <w:fldChar w:fldCharType="end"/>
-      </w:r>
-      <w:r>
-        <w:t>1</w:t>
-      </w:r>
-      <w:r>
-        <w:rPr>
-          <w:i/>
-          <w:sz w:val="18"/>
-        </w:rPr>
-        <w:t>. Energy by condition, faceted by model. Direction is consistent; magnitude varies.</w:t>
+        <w:t>Figure 5. Energy by condition, faceted by model. Direction is consistent; magnitude varies.</w:t>
       </w:r>
     </w:p>
     <w:p>
@@ -5558,23 +7550,7 @@
           <w:i/>
           <w:sz w:val="18"/>
         </w:rPr>
-        <w:t xml:space="preserve">Table </w:t>
-      </w:r>
-      <w:r>
-        <w:fldChar w:fldCharType="begin"/>
-        <w:instrText xml:space="preserve"> SEQ Table</w:instrText>
-        <w:fldChar w:fldCharType="separate"/>
-        <w:fldChar w:fldCharType="end"/>
-      </w:r>
-      <w:r>
-        <w:t>1</w:t>
-      </w:r>
-      <w:r>
-        <w:rPr>
-          <w:i/>
-          <w:sz w:val="18"/>
-        </w:rPr>
-        <w:t>. Energy change by category (from energy_report.json).</w:t>
+        <w:t>Table 10. Energy change by category (from energy_report.json).</w:t>
       </w:r>
     </w:p>
     <w:tbl>
@@ -6075,23 +8051,7 @@
           <w:i/>
           <w:sz w:val="18"/>
         </w:rPr>
-        <w:t xml:space="preserve">Figure </w:t>
-      </w:r>
-      <w:r>
-        <w:fldChar w:fldCharType="begin"/>
-        <w:instrText xml:space="preserve"> SEQ Figure</w:instrText>
-        <w:fldChar w:fldCharType="separate"/>
-        <w:fldChar w:fldCharType="end"/>
-      </w:r>
-      <w:r>
-        <w:t>1</w:t>
-      </w:r>
-      <w:r>
-        <w:rPr>
-          <w:i/>
-          <w:sz w:val="18"/>
-        </w:rPr>
-        <w:t>. Mean energy change versus one-shot by task category.</w:t>
+        <w:t>Figure 6. Mean energy change versus one-shot by task category.</w:t>
       </w:r>
     </w:p>
     <w:p>
@@ -6166,23 +8126,7 @@
           <w:i/>
           <w:sz w:val="18"/>
         </w:rPr>
-        <w:t xml:space="preserve">Figure </w:t>
-      </w:r>
-      <w:r>
-        <w:fldChar w:fldCharType="begin"/>
-        <w:instrText xml:space="preserve"> SEQ Figure</w:instrText>
-        <w:fldChar w:fldCharType="separate"/>
-        <w:fldChar w:fldCharType="end"/>
-      </w:r>
-      <w:r>
-        <w:t>1</w:t>
-      </w:r>
-      <w:r>
-        <w:rPr>
-          <w:i/>
-          <w:sz w:val="18"/>
-        </w:rPr>
-        <w:t>. Runtime versus package energy (log–log). Energy is runtime-dominated; the C4 cloud extends to longer runtimes.</w:t>
+        <w:t>Figure 7. Runtime versus package energy (log–log). Energy is runtime-dominated; the C4 cloud extends to longer runtimes.</w:t>
       </w:r>
     </w:p>
     <w:p>
@@ -6205,23 +8149,7 @@
           <w:i/>
           <w:sz w:val="18"/>
         </w:rPr>
-        <w:t xml:space="preserve">Table </w:t>
-      </w:r>
-      <w:r>
-        <w:fldChar w:fldCharType="begin"/>
-        <w:instrText xml:space="preserve"> SEQ Table</w:instrText>
-        <w:fldChar w:fldCharType="separate"/>
-        <w:fldChar w:fldCharType="end"/>
-      </w:r>
-      <w:r>
-        <w:t>1</w:t>
-      </w:r>
-      <w:r>
-        <w:rPr>
-          <w:i/>
-          <w:sz w:val="18"/>
-        </w:rPr>
-        <w:t>. Static metrics by condition (from complexity_metrics.json). Size and branching grow monotonically C0→C4.</w:t>
+        <w:t>Table 11. Static metrics by condition (from complexity_metrics.json). Size and branching grow monotonically C0→C4.</w:t>
       </w:r>
     </w:p>
     <w:tbl>
@@ -6851,23 +8779,7 @@
           <w:i/>
           <w:sz w:val="18"/>
         </w:rPr>
-        <w:t xml:space="preserve">Figure </w:t>
-      </w:r>
-      <w:r>
-        <w:fldChar w:fldCharType="begin"/>
-        <w:instrText xml:space="preserve"> SEQ Figure</w:instrText>
-        <w:fldChar w:fldCharType="separate"/>
-        <w:fldChar w:fldCharType="end"/>
-      </w:r>
-      <w:r>
-        <w:t>1</w:t>
-      </w:r>
-      <w:r>
-        <w:rPr>
-          <w:i/>
-          <w:sz w:val="18"/>
-        </w:rPr>
-        <w:t>. SLOC distribution by condition. C4 programs are markedly longer (median 98.5 vs 58 SLOC).</w:t>
+        <w:t>Figure 8. SLOC distribution by condition. C4 programs are markedly longer (median 98.5 vs 58 SLOC).</w:t>
       </w:r>
     </w:p>
     <w:p>
@@ -6890,23 +8802,7 @@
           <w:i/>
           <w:sz w:val="18"/>
         </w:rPr>
-        <w:t xml:space="preserve">Table </w:t>
-      </w:r>
-      <w:r>
-        <w:fldChar w:fldCharType="begin"/>
-        <w:instrText xml:space="preserve"> SEQ Table</w:instrText>
-        <w:fldChar w:fldCharType="separate"/>
-        <w:fldChar w:fldCharType="end"/>
-      </w:r>
-      <w:r>
-        <w:t>1</w:t>
-      </w:r>
-      <w:r>
-        <w:rPr>
-          <w:i/>
-          <w:sz w:val="18"/>
-        </w:rPr>
-        <w:t>. Estimated time-complexity class distribution (n=1471, from complexity_metrics.json).</w:t>
+        <w:t>Table 12. Estimated time-complexity class distribution (n=1471, from complexity_metrics.json).</w:t>
       </w:r>
     </w:p>
     <w:tbl>
@@ -7277,23 +9173,7 @@
           <w:i/>
           <w:sz w:val="18"/>
         </w:rPr>
-        <w:t xml:space="preserve">Figure </w:t>
-      </w:r>
-      <w:r>
-        <w:fldChar w:fldCharType="begin"/>
-        <w:instrText xml:space="preserve"> SEQ Figure</w:instrText>
-        <w:fldChar w:fldCharType="separate"/>
-        <w:fldChar w:fldCharType="end"/>
-      </w:r>
-      <w:r>
-        <w:t>1</w:t>
-      </w:r>
-      <w:r>
-        <w:rPr>
-          <w:i/>
-          <w:sz w:val="18"/>
-        </w:rPr>
-        <w:t>. Estimated complexity-class mix by condition. Quadratic-plus share is stable (~47–48%); C4 adds SLOC without shifting the class mix.</w:t>
+        <w:t>Figure 9. Estimated complexity-class mix by condition. Quadratic-plus share is stable (~47–48%); C4 adds SLOC without shifting the class mix.</w:t>
       </w:r>
     </w:p>
     <w:p>
@@ -7328,23 +9208,7 @@
           <w:i/>
           <w:sz w:val="18"/>
         </w:rPr>
-        <w:t xml:space="preserve">Table </w:t>
-      </w:r>
-      <w:r>
-        <w:fldChar w:fldCharType="begin"/>
-        <w:instrText xml:space="preserve"> SEQ Table</w:instrText>
-        <w:fldChar w:fldCharType="separate"/>
-        <w:fldChar w:fldCharType="end"/>
-      </w:r>
-      <w:r>
-        <w:t>1</w:t>
-      </w:r>
-      <w:r>
-        <w:rPr>
-          <w:i/>
-          <w:sz w:val="18"/>
-        </w:rPr>
-        <w:t>. Agreement matrix, static estimator vs empirical slope (n=61, precision=0.212, recall=0.875).</w:t>
+        <w:t>Table 13. Agreement matrix, static estimator vs empirical slope (n=61, precision=0.212, recall=0.875).</w:t>
       </w:r>
     </w:p>
     <w:tbl>
@@ -7574,23 +9438,7 @@
           <w:i/>
           <w:sz w:val="18"/>
         </w:rPr>
-        <w:t xml:space="preserve">Figure </w:t>
-      </w:r>
-      <w:r>
-        <w:fldChar w:fldCharType="begin"/>
-        <w:instrText xml:space="preserve"> SEQ Figure</w:instrText>
-        <w:fldChar w:fldCharType="separate"/>
-        <w:fldChar w:fldCharType="end"/>
-      </w:r>
-      <w:r>
-        <w:t>1</w:t>
-      </w:r>
-      <w:r>
-        <w:rPr>
-          <w:i/>
-          <w:sz w:val="18"/>
-        </w:rPr>
-        <w:t>. Empirical growth-exponent (log–log slope) distribution. Most programs scale near-linearly; the superlinear tail is small.</w:t>
+        <w:t>Figure 10. Empirical growth-exponent (log–log slope) distribution. Most programs scale near-linearly; the superlinear tail is small.</w:t>
       </w:r>
     </w:p>
     <w:p>
@@ -7613,23 +9461,7 @@
           <w:i/>
           <w:sz w:val="18"/>
         </w:rPr>
-        <w:t xml:space="preserve">Table </w:t>
-      </w:r>
-      <w:r>
-        <w:fldChar w:fldCharType="begin"/>
-        <w:instrText xml:space="preserve"> SEQ Table</w:instrText>
-        <w:fldChar w:fldCharType="separate"/>
-        <w:fldChar w:fldCharType="end"/>
-      </w:r>
-      <w:r>
-        <w:t>1</w:t>
-      </w:r>
-      <w:r>
-        <w:rPr>
-          <w:i/>
-          <w:sz w:val="18"/>
-        </w:rPr>
-        <w:t>. Cross-metric correlations on measured programs (from complexity_summary.json).</w:t>
+        <w:t>Table 14. Cross-metric correlations on measured programs (from complexity_summary.json).</w:t>
       </w:r>
     </w:p>
     <w:tbl>
@@ -8125,23 +9957,7 @@
           <w:i/>
           <w:sz w:val="18"/>
         </w:rPr>
-        <w:t xml:space="preserve">Table </w:t>
-      </w:r>
-      <w:r>
-        <w:fldChar w:fldCharType="begin"/>
-        <w:instrText xml:space="preserve"> SEQ Table</w:instrText>
-        <w:fldChar w:fldCharType="separate"/>
-        <w:fldChar w:fldCharType="end"/>
-      </w:r>
-      <w:r>
-        <w:t>1</w:t>
-      </w:r>
-      <w:r>
-        <w:rPr>
-          <w:i/>
-          <w:sz w:val="18"/>
-        </w:rPr>
-        <w:t>. Carbon sensitivity by grid intensity (from carbon_report.json).</w:t>
+        <w:t>Table 15. Carbon sensitivity by grid intensity (from carbon_report.json).</w:t>
       </w:r>
     </w:p>
     <w:tbl>
@@ -8598,23 +10414,7 @@
           <w:i/>
           <w:sz w:val="18"/>
         </w:rPr>
-        <w:t xml:space="preserve">Figure </w:t>
-      </w:r>
-      <w:r>
-        <w:fldChar w:fldCharType="begin"/>
-        <w:instrText xml:space="preserve"> SEQ Figure</w:instrText>
-        <w:fldChar w:fldCharType="separate"/>
-        <w:fldChar w:fldCharType="end"/>
-      </w:r>
-      <w:r>
-        <w:t>1</w:t>
-      </w:r>
-      <w:r>
-        <w:rPr>
-          <w:i/>
-          <w:sz w:val="18"/>
-        </w:rPr>
-        <w:t>. Carbon-equivalent by condition across grid intensities. Rankings are intensity-invariant.</w:t>
+        <w:t>Figure 11. Carbon-equivalent by condition across grid intensities. Rankings are intensity-invariant.</w:t>
       </w:r>
     </w:p>
     <w:p>
@@ -8649,23 +10449,7 @@
           <w:i/>
           <w:sz w:val="18"/>
         </w:rPr>
-        <w:t xml:space="preserve">Table </w:t>
-      </w:r>
-      <w:r>
-        <w:fldChar w:fldCharType="begin"/>
-        <w:instrText xml:space="preserve"> SEQ Table</w:instrText>
-        <w:fldChar w:fldCharType="separate"/>
-        <w:fldChar w:fldCharType="end"/>
-      </w:r>
-      <w:r>
-        <w:t>1</w:t>
-      </w:r>
-      <w:r>
-        <w:rPr>
-          <w:i/>
-          <w:sz w:val="18"/>
-        </w:rPr>
-        <w:t>. Unmeasured units by reason (from energy_failures.csv).</w:t>
+        <w:t>Table 16. Unmeasured units by reason (from energy_failures.csv).</w:t>
       </w:r>
     </w:p>
     <w:tbl>
@@ -8984,23 +10768,7 @@
           <w:i/>
           <w:sz w:val="18"/>
         </w:rPr>
-        <w:t xml:space="preserve">Table </w:t>
-      </w:r>
-      <w:r>
-        <w:fldChar w:fldCharType="begin"/>
-        <w:instrText xml:space="preserve"> SEQ Table</w:instrText>
-        <w:fldChar w:fldCharType="separate"/>
-        <w:fldChar w:fldCharType="end"/>
-      </w:r>
-      <w:r>
-        <w:t>1</w:t>
-      </w:r>
-      <w:r>
-        <w:rPr>
-          <w:i/>
-          <w:sz w:val="18"/>
-        </w:rPr>
-        <w:t>. Unmeasured units by category.</w:t>
+        <w:t>Table 17. Unmeasured units by category.</w:t>
       </w:r>
     </w:p>
     <w:tbl>
@@ -9266,23 +11034,7 @@
           <w:i/>
           <w:sz w:val="18"/>
         </w:rPr>
-        <w:t xml:space="preserve">Figure </w:t>
-      </w:r>
-      <w:r>
-        <w:fldChar w:fldCharType="begin"/>
-        <w:instrText xml:space="preserve"> SEQ Figure</w:instrText>
-        <w:fldChar w:fldCharType="separate"/>
-        <w:fldChar w:fldCharType="end"/>
-      </w:r>
-      <w:r>
-        <w:t>1</w:t>
-      </w:r>
-      <w:r>
-        <w:rPr>
-          <w:i/>
-          <w:sz w:val="18"/>
-        </w:rPr>
-        <w:t>. Unmeasured-unit rate by condition. Full multi-turn fails most often — complexity has a correctness cost too.</w:t>
+        <w:t>Figure 12. Unmeasured-unit rate by condition. Full multi-turn fails most often — complexity has a correctness cost too.</w:t>
       </w:r>
     </w:p>
     <w:p>
@@ -9446,6 +11198,29 @@
     </w:p>
     <w:p>
       <w:pPr>
+        <w:pStyle w:val="Heading2"/>
+      </w:pPr>
+      <w:r>
+        <w:rPr>
+          <w:color w:val="333333"/>
+        </w:rPr>
+        <w:t>5.6  Carbon scope and scale</w:t>
+      </w:r>
+    </w:p>
+    <w:p>
+      <w:pPr>
+        <w:jc w:val="both"/>
+      </w:pPr>
+      <w:r>
+        <w:rPr>
+          <w:b w:val="0"/>
+          <w:i w:val="0"/>
+        </w:rPr>
+        <w:t>Scope: operational carbon from CPU package energy only — a lower bound excluding DRAM/GPU, idle power, embodied carbon, and LLM inference energy. Scale (illustrative, global-average grid): the paired mean overhead (+0.716 J ≈ +95.5 µg/run) reaches ≈95.5 g per million and ≈95.5 kg per billion executions (≈620 km of driving; ≈5 tree-years); the paired median (+0.0315 J ≈ +4.2 µg) reaches ≈4.2 kg per billion. The worst corpus program (AC-012, deepseek edge-case, 67.9 J) emits ≈9.1 mg per run — 85× the median — so fleets are driven by tails. Real-world impact is amplified by rework waste (20.7% vs 6.3% failure) and rebound effects, but the near-zero bug-fix turn (median −0.1%) shows not all iteration is harmful.</w:t>
+      </w:r>
+    </w:p>
+    <w:p>
+      <w:pPr>
         <w:pStyle w:val="Heading1"/>
       </w:pPr>
       <w:r>
@@ -9530,7 +11305,7 @@
           <w:b w:val="0"/>
           <w:i w:val="0"/>
         </w:rPr>
-        <w:t>Results come from one host (Intel RAPL, 8 CPUs), Python only, and four models. Generalisation to other hardware, models, or languages requires replication. Search &amp; Retrieval (n=2) cannot support category-level claims.</w:t>
+        <w:t>Results come from one host (Intel i5-8250U, package RAPL), Python only, and four models. Generalisation to other hardware, models, or languages requires replication. Search &amp; Retrieval (n=2) cannot support category-level claims.</w:t>
       </w:r>
     </w:p>
     <w:p>
@@ -9690,6 +11465,29 @@
     </w:p>
     <w:p>
       <w:pPr>
+        <w:pStyle w:val="Heading2"/>
+      </w:pPr>
+      <w:r>
+        <w:rPr>
+          <w:color w:val="333333"/>
+        </w:rPr>
+        <w:t>Author contributions</w:t>
+      </w:r>
+    </w:p>
+    <w:p>
+      <w:pPr>
+        <w:jc w:val="both"/>
+      </w:pPr>
+      <w:r>
+        <w:rPr>
+          <w:b w:val="0"/>
+          <w:i w:val="0"/>
+        </w:rPr>
+        <w:t>Task authorship followed per-category ownership (25 candidates each): file &amp; data — M.I. Sizan; text &amp; log — M.K.H. Milu; search &amp; retrieval — M.N. Huda; algorithms &amp; computation — A.F. Prity; image &amp; media — T.T. Priyonta; realistic applications — S.A. Subarna. All authors contributed to interaction design, measurement, analysis, and writing.</w:t>
+      </w:r>
+    </w:p>
+    <w:p>
+      <w:pPr>
         <w:pStyle w:val="Heading1"/>
       </w:pPr>
       <w:r>
@@ -9973,6 +11771,28 @@
       </w:r>
     </w:p>
     <w:p>
+      <w:pPr>
+        <w:spacing w:after="60"/>
+      </w:pPr>
+      <w:r>
+        <w:rPr>
+          <w:sz w:val="18"/>
+        </w:rPr>
+        <w:t>[25]  D. Huang et al. EffiBench: Benchmarking the efficiency of automatically generated code. Proc. NeurIPS, 2024.</w:t>
+      </w:r>
+    </w:p>
+    <w:p>
+      <w:pPr>
+        <w:spacing w:after="60"/>
+      </w:pPr>
+      <w:r>
+        <w:rPr>
+          <w:sz w:val="18"/>
+        </w:rPr>
+        <w:t>[26]  A. Di Bernardo et al. Do LLMs dream of energy-efficient code? Proc. LLM4Code (ICSE Workshop), 2026.</w:t>
+      </w:r>
+    </w:p>
+    <w:p>
       <w:r>
         <w:br w:type="page"/>
       </w:r>
@@ -10016,23 +11836,7 @@
           <w:i/>
           <w:sz w:val="18"/>
         </w:rPr>
-        <w:t xml:space="preserve">Table </w:t>
-      </w:r>
-      <w:r>
-        <w:fldChar w:fldCharType="begin"/>
-        <w:instrText xml:space="preserve"> SEQ Table</w:instrText>
-        <w:fldChar w:fldCharType="separate"/>
-        <w:fldChar w:fldCharType="end"/>
-      </w:r>
-      <w:r>
-        <w:t>1</w:t>
-      </w:r>
-      <w:r>
-        <w:rPr>
-          <w:i/>
-          <w:sz w:val="18"/>
-        </w:rPr>
-        <w:t>. Full task catalog (from dataset/*/dataset.json).</w:t>
+        <w:t>Table 18. Full task catalog (from dataset/*/dataset.json).</w:t>
       </w:r>
     </w:p>
     <w:tbl>
@@ -21132,23 +22936,7 @@
           <w:i/>
           <w:sz w:val="18"/>
         </w:rPr>
-        <w:t xml:space="preserve">Table </w:t>
-      </w:r>
-      <w:r>
-        <w:fldChar w:fldCharType="begin"/>
-        <w:instrText xml:space="preserve"> SEQ Table</w:instrText>
-        <w:fldChar w:fldCharType="separate"/>
-        <w:fldChar w:fldCharType="end"/>
-      </w:r>
-      <w:r>
-        <w:t>1</w:t>
-      </w:r>
-      <w:r>
-        <w:rPr>
-          <w:i/>
-          <w:sz w:val="18"/>
-        </w:rPr>
-        <w:t>. Static metrics per condition (from complexity_metrics.json).</w:t>
+        <w:t>Table 19. Static metrics per condition (from complexity_metrics.json).</w:t>
       </w:r>
     </w:p>
     <w:tbl>
@@ -22000,23 +23788,7 @@
           <w:i/>
           <w:sz w:val="18"/>
         </w:rPr>
-        <w:t xml:space="preserve">Table </w:t>
-      </w:r>
-      <w:r>
-        <w:fldChar w:fldCharType="begin"/>
-        <w:instrText xml:space="preserve"> SEQ Table</w:instrText>
-        <w:fldChar w:fldCharType="separate"/>
-        <w:fldChar w:fldCharType="end"/>
-      </w:r>
-      <w:r>
-        <w:t>1</w:t>
-      </w:r>
-      <w:r>
-        <w:rPr>
-          <w:i/>
-          <w:sz w:val="18"/>
-        </w:rPr>
-        <w:t>. Glossary of tracked metrics.</w:t>
+        <w:t>Table 20. Glossary of tracked metrics.</w:t>
       </w:r>
     </w:p>
     <w:tbl>
@@ -22417,23 +24189,7 @@
           <w:i/>
           <w:sz w:val="18"/>
         </w:rPr>
-        <w:t xml:space="preserve">Table </w:t>
-      </w:r>
-      <w:r>
-        <w:fldChar w:fldCharType="begin"/>
-        <w:instrText xml:space="preserve"> SEQ Table</w:instrText>
-        <w:fldChar w:fldCharType="separate"/>
-        <w:fldChar w:fldCharType="end"/>
-      </w:r>
-      <w:r>
-        <w:t>1</w:t>
-      </w:r>
-      <w:r>
-        <w:rPr>
-          <w:i/>
-          <w:sz w:val="18"/>
-        </w:rPr>
-        <w:t>. Failure taxonomy (from energy_failures.csv).</w:t>
+        <w:t>Table 21. Failure taxonomy (from energy_failures.csv).</w:t>
       </w:r>
     </w:p>
     <w:tbl>
@@ -23374,9 +25130,9 @@
     <w:p>
       <w:r>
         <w:fldChar w:fldCharType="begin"/>
-        <w:instrText xml:space="preserve">INDEX \c "1"</w:instrText>
+        <w:instrText xml:space="preserve"/>
         <w:fldChar w:fldCharType="separate"/>
-        <w:t>Right-click → Update Field to build the index.</w:t>
+        <w:t/>
         <w:fldChar w:fldCharType="end"/>
       </w:r>
     </w:p>

</xml_diff>

<commit_message>
paper: drop per-member task mapping, generic contributions
</commit_message>
<xml_diff>
--- a/docx/green-code-interaction-benchmark.docx
+++ b/docx/green-code-interaction-benchmark.docx
@@ -3637,7 +3637,7 @@
           <w:b w:val="0"/>
           <w:i w:val="0"/>
         </w:rPr>
-        <w:t>Task provenance: six team members authored 25 candidate tasks each (150 candidates), quality-checked for duplicates, clarity, and feasibility with per-category ownership; a pilot study validated prompts, trajectory separation, and measurement resolution before full collection. Conversations reset per cell; no manual repair.</w:t>
+        <w:t>Task provenance: six team members authored 25 candidate tasks each (150 candidates), quality-checked for duplicates, clarity, and feasibility; a pilot study validated prompts, trajectory separation, and measurement resolution before full collection. Conversations reset per cell; no manual repair.</w:t>
       </w:r>
     </w:p>
     <w:p>
@@ -11483,7 +11483,7 @@
           <w:b w:val="0"/>
           <w:i w:val="0"/>
         </w:rPr>
-        <w:t>Task authorship followed per-category ownership (25 candidates each): file &amp; data — M.I. Sizan; text &amp; log — M.K.H. Milu; search &amp; retrieval — M.N. Huda; algorithms &amp; computation — A.F. Prity; image &amp; media — T.T. Priyonta; realistic applications — S.A. Subarna. All authors contributed to interaction design, measurement, analysis, and writing.</w:t>
+        <w:t>All authors contributed equally to task design, interaction design, measurement, analysis, and writing.</w:t>
       </w:r>
     </w:p>
     <w:p>

</xml_diff>

<commit_message>
docx: 3x3 author grid with affiliation + emails on cover
</commit_message>
<xml_diff>
--- a/docx/green-code-interaction-benchmark.docx
+++ b/docx/green-code-interaction-benchmark.docx
@@ -47,6 +47,329 @@
         <w:t>A benchmark study of one-shot versus multi-turn AI-assisted programming — 1418 final programs in scope, RAPL energy measurement, static + empirical complexity analysis</w:t>
       </w:r>
     </w:p>
+    <w:tbl>
+      <w:tblPr>
+        <w:tblW w:type="auto" w:w="0"/>
+        <w:jc w:val="center"/>
+        <w:tblLook w:firstColumn="1" w:firstRow="1" w:lastColumn="0" w:lastRow="0" w:noHBand="0" w:noVBand="1" w:val="04A0"/>
+      </w:tblPr>
+      <w:tblGrid>
+        <w:gridCol w:w="3154"/>
+        <w:gridCol w:w="3154"/>
+        <w:gridCol w:w="3154"/>
+      </w:tblGrid>
+      <w:tr>
+        <w:tc>
+          <w:tcPr>
+            <w:tcW w:type="dxa" w:w="3154"/>
+          </w:tcPr>
+          <w:p>
+            <w:pPr>
+              <w:jc w:val="center"/>
+            </w:pPr>
+            <w:r/>
+            <w:r>
+              <w:rPr>
+                <w:b/>
+                <w:sz w:val="20"/>
+              </w:rPr>
+              <w:t>MD. Nurul Huda</w:t>
+            </w:r>
+          </w:p>
+          <w:p>
+            <w:pPr>
+              <w:jc w:val="center"/>
+            </w:pPr>
+            <w:r>
+              <w:rPr>
+                <w:sz w:val="17"/>
+              </w:rPr>
+              <w:t>Dept. of CSE</w:t>
+            </w:r>
+          </w:p>
+          <w:p>
+            <w:pPr>
+              <w:jc w:val="center"/>
+            </w:pPr>
+            <w:r>
+              <w:rPr>
+                <w:sz w:val="17"/>
+              </w:rPr>
+              <w:t>United International University</w:t>
+            </w:r>
+          </w:p>
+          <w:p>
+            <w:pPr>
+              <w:jc w:val="center"/>
+            </w:pPr>
+            <w:r>
+              <w:rPr>
+                <w:sz w:val="17"/>
+              </w:rPr>
+              <w:t>mhuda223303@bscse.uiu.ac.bd</w:t>
+            </w:r>
+          </w:p>
+        </w:tc>
+        <w:tc>
+          <w:tcPr>
+            <w:tcW w:type="dxa" w:w="3154"/>
+          </w:tcPr>
+          <w:p>
+            <w:pPr>
+              <w:jc w:val="center"/>
+            </w:pPr>
+            <w:r/>
+            <w:r>
+              <w:rPr>
+                <w:b/>
+                <w:sz w:val="20"/>
+              </w:rPr>
+              <w:t>MD. Khaled Hasan Milu</w:t>
+            </w:r>
+          </w:p>
+          <w:p>
+            <w:pPr>
+              <w:jc w:val="center"/>
+            </w:pPr>
+            <w:r>
+              <w:rPr>
+                <w:sz w:val="17"/>
+              </w:rPr>
+              <w:t>Dept. of CSE</w:t>
+            </w:r>
+          </w:p>
+          <w:p>
+            <w:pPr>
+              <w:jc w:val="center"/>
+            </w:pPr>
+            <w:r>
+              <w:rPr>
+                <w:sz w:val="17"/>
+              </w:rPr>
+              <w:t>United International University</w:t>
+            </w:r>
+          </w:p>
+          <w:p>
+            <w:pPr>
+              <w:jc w:val="center"/>
+            </w:pPr>
+            <w:r>
+              <w:rPr>
+                <w:sz w:val="17"/>
+              </w:rPr>
+              <w:t>mmilu223104@bscse.uiu.ac.bd</w:t>
+            </w:r>
+          </w:p>
+        </w:tc>
+        <w:tc>
+          <w:tcPr>
+            <w:tcW w:type="dxa" w:w="3154"/>
+          </w:tcPr>
+          <w:p>
+            <w:pPr>
+              <w:jc w:val="center"/>
+            </w:pPr>
+            <w:r/>
+            <w:r>
+              <w:rPr>
+                <w:b/>
+                <w:sz w:val="20"/>
+              </w:rPr>
+              <w:t>MD. Minhazul Islam</w:t>
+            </w:r>
+          </w:p>
+          <w:p>
+            <w:pPr>
+              <w:jc w:val="center"/>
+            </w:pPr>
+            <w:r>
+              <w:rPr>
+                <w:sz w:val="17"/>
+              </w:rPr>
+              <w:t>Dept. of CSE</w:t>
+            </w:r>
+          </w:p>
+          <w:p>
+            <w:pPr>
+              <w:jc w:val="center"/>
+            </w:pPr>
+            <w:r>
+              <w:rPr>
+                <w:sz w:val="17"/>
+              </w:rPr>
+              <w:t>United International University</w:t>
+            </w:r>
+          </w:p>
+          <w:p>
+            <w:pPr>
+              <w:jc w:val="center"/>
+            </w:pPr>
+            <w:r>
+              <w:rPr>
+                <w:sz w:val="17"/>
+              </w:rPr>
+              <w:t>mislam223301@bscse.uiu.ac.bd</w:t>
+            </w:r>
+          </w:p>
+        </w:tc>
+      </w:tr>
+      <w:tr>
+        <w:tc>
+          <w:tcPr>
+            <w:tcW w:type="dxa" w:w="3154"/>
+          </w:tcPr>
+          <w:p>
+            <w:pPr>
+              <w:jc w:val="center"/>
+            </w:pPr>
+            <w:r/>
+            <w:r>
+              <w:rPr>
+                <w:b/>
+                <w:sz w:val="20"/>
+              </w:rPr>
+              <w:t>Atkia Fayrose Prity</w:t>
+            </w:r>
+          </w:p>
+          <w:p>
+            <w:pPr>
+              <w:jc w:val="center"/>
+            </w:pPr>
+            <w:r>
+              <w:rPr>
+                <w:sz w:val="17"/>
+              </w:rPr>
+              <w:t>Dept. of CSE</w:t>
+            </w:r>
+          </w:p>
+          <w:p>
+            <w:pPr>
+              <w:jc w:val="center"/>
+            </w:pPr>
+            <w:r>
+              <w:rPr>
+                <w:sz w:val="17"/>
+              </w:rPr>
+              <w:t>United International University</w:t>
+            </w:r>
+          </w:p>
+          <w:p>
+            <w:pPr>
+              <w:jc w:val="center"/>
+            </w:pPr>
+            <w:r>
+              <w:rPr>
+                <w:sz w:val="17"/>
+              </w:rPr>
+              <w:t>aprity223101@bscse.uiu.ac.bd</w:t>
+            </w:r>
+          </w:p>
+        </w:tc>
+        <w:tc>
+          <w:tcPr>
+            <w:tcW w:type="dxa" w:w="3154"/>
+          </w:tcPr>
+          <w:p>
+            <w:pPr>
+              <w:jc w:val="center"/>
+            </w:pPr>
+            <w:r/>
+            <w:r>
+              <w:rPr>
+                <w:b/>
+                <w:sz w:val="20"/>
+              </w:rPr>
+              <w:t>Tanjila Tafrim Priyonta</w:t>
+            </w:r>
+          </w:p>
+          <w:p>
+            <w:pPr>
+              <w:jc w:val="center"/>
+            </w:pPr>
+            <w:r>
+              <w:rPr>
+                <w:sz w:val="17"/>
+              </w:rPr>
+              <w:t>Dept. of CSE</w:t>
+            </w:r>
+          </w:p>
+          <w:p>
+            <w:pPr>
+              <w:jc w:val="center"/>
+            </w:pPr>
+            <w:r>
+              <w:rPr>
+                <w:sz w:val="17"/>
+              </w:rPr>
+              <w:t>United International University</w:t>
+            </w:r>
+          </w:p>
+          <w:p>
+            <w:pPr>
+              <w:jc w:val="center"/>
+            </w:pPr>
+            <w:r>
+              <w:rPr>
+                <w:sz w:val="17"/>
+              </w:rPr>
+              <w:t>tpriyonta223111@bscse.uiu.ac.bd</w:t>
+            </w:r>
+          </w:p>
+        </w:tc>
+        <w:tc>
+          <w:tcPr>
+            <w:tcW w:type="dxa" w:w="3154"/>
+          </w:tcPr>
+          <w:p>
+            <w:pPr>
+              <w:jc w:val="center"/>
+            </w:pPr>
+            <w:r/>
+            <w:r>
+              <w:rPr>
+                <w:b/>
+                <w:sz w:val="20"/>
+              </w:rPr>
+              <w:t>Sumiya Akter Subarna</w:t>
+            </w:r>
+          </w:p>
+          <w:p>
+            <w:pPr>
+              <w:jc w:val="center"/>
+            </w:pPr>
+            <w:r>
+              <w:rPr>
+                <w:sz w:val="17"/>
+              </w:rPr>
+              <w:t>Dept. of CSE</w:t>
+            </w:r>
+          </w:p>
+          <w:p>
+            <w:pPr>
+              <w:jc w:val="center"/>
+            </w:pPr>
+            <w:r>
+              <w:rPr>
+                <w:sz w:val="17"/>
+              </w:rPr>
+              <w:t>United International University</w:t>
+            </w:r>
+          </w:p>
+          <w:p>
+            <w:pPr>
+              <w:jc w:val="center"/>
+            </w:pPr>
+            <w:r>
+              <w:rPr>
+                <w:sz w:val="17"/>
+              </w:rPr>
+              <w:t>ssubarna2231053@bscse.uiu.ac.bd</w:t>
+            </w:r>
+          </w:p>
+        </w:tc>
+      </w:tr>
+    </w:tbl>
+    <w:p/>
     <w:tbl>
       <w:tblPr>
         <w:tblStyle w:val="TableGrid"/>

</xml_diff>